<commit_message>
Auto update 07.08.2026 17:12:07,33
</commit_message>
<xml_diff>
--- a/Стандарт №3 проектирования железнодорожной техники в Stormworks Build&Rescue от 07.08.2026 г..docx
+++ b/Стандарт №3 проектирования железнодорожной техники в Stormworks Build&Rescue от 07.08.2026 г..docx
@@ -3916,6 +3916,14 @@
     <w:p>
       <w:pPr>
         <w:jc w:val="both"/>
+      </w:pPr>
+      <w:r>
+        <w:t>*ДОПОЛНИТЬ ВАРИАНТАМИ ПЕРЕМЕННОГО И ПОСТОЯННОГО ТОКА*</w:t>
+      </w:r>
+    </w:p>
+    <w:p>
+      <w:pPr>
+        <w:jc w:val="both"/>
         <w:rPr>
           <w:rFonts w:asciiTheme="majorHAnsi" w:eastAsiaTheme="majorEastAsia" w:hAnsiTheme="majorHAnsi" w:cstheme="majorBidi"/>
           <w:color w:val="0F4761" w:themeColor="accent1" w:themeShade="BF"/>
@@ -6416,29 +6424,7 @@
               <w:rPr>
                 <w:lang w:val="en-US"/>
               </w:rPr>
-              <w:t>Independent Brake, [</w:t>
-            </w:r>
-            <w:proofErr w:type="spellStart"/>
-            <w:r>
-              <w:rPr>
-                <w:lang w:val="en-US"/>
-              </w:rPr>
-              <w:t>Release|Hold|I-IV</w:t>
-            </w:r>
-            <w:proofErr w:type="spellEnd"/>
-            <w:proofErr w:type="gramStart"/>
-            <w:r>
-              <w:rPr>
-                <w:lang w:val="en-US"/>
-              </w:rPr>
-              <w:t>],A</w:t>
-            </w:r>
-            <w:proofErr w:type="gramEnd"/>
-            <w:r>
-              <w:rPr>
-                <w:lang w:val="en-US"/>
-              </w:rPr>
-              <w:t>+|D-</w:t>
+              <w:t>Independent Brake, [Release|Hold|I-IV],A+|D-</w:t>
             </w:r>
           </w:p>
         </w:tc>
@@ -6481,91 +6467,7 @@
               <w:rPr>
                 <w:lang w:val="en-US"/>
               </w:rPr>
-              <w:t>Train Brake, [</w:t>
-            </w:r>
-            <w:proofErr w:type="spellStart"/>
-            <w:r>
-              <w:rPr>
-                <w:lang w:val="en-US"/>
-              </w:rPr>
-              <w:t>Release|Hold|Overlap</w:t>
-            </w:r>
-            <w:proofErr w:type="spellEnd"/>
-            <w:r>
-              <w:rPr>
-                <w:lang w:val="en-US"/>
-              </w:rPr>
-              <w:t xml:space="preserve"> /wo </w:t>
-            </w:r>
-            <w:proofErr w:type="spellStart"/>
-            <w:r>
-              <w:rPr>
-                <w:lang w:val="en-US"/>
-              </w:rPr>
-              <w:t>Feed|Overlap</w:t>
-            </w:r>
-            <w:proofErr w:type="spellEnd"/>
-            <w:r>
-              <w:rPr>
-                <w:lang w:val="en-US"/>
-              </w:rPr>
-              <w:t xml:space="preserve"> /w </w:t>
-            </w:r>
-            <w:proofErr w:type="spellStart"/>
-            <w:r>
-              <w:rPr>
-                <w:lang w:val="en-US"/>
-              </w:rPr>
-              <w:t>Feed|Small</w:t>
-            </w:r>
-            <w:proofErr w:type="spellEnd"/>
-            <w:r>
-              <w:rPr>
-                <w:lang w:val="en-US"/>
-              </w:rPr>
-              <w:t xml:space="preserve"> Service </w:t>
-            </w:r>
-            <w:proofErr w:type="spellStart"/>
-            <w:r>
-              <w:rPr>
-                <w:lang w:val="en-US"/>
-              </w:rPr>
-              <w:t>Br.|Service</w:t>
-            </w:r>
-            <w:proofErr w:type="spellEnd"/>
-            <w:r>
-              <w:rPr>
-                <w:lang w:val="en-US"/>
-              </w:rPr>
-              <w:t xml:space="preserve"> </w:t>
-            </w:r>
-            <w:proofErr w:type="spellStart"/>
-            <w:r>
-              <w:rPr>
-                <w:lang w:val="en-US"/>
-              </w:rPr>
-              <w:t>Br.|Emergency</w:t>
-            </w:r>
-            <w:proofErr w:type="spellEnd"/>
-            <w:r>
-              <w:rPr>
-                <w:lang w:val="en-US"/>
-              </w:rPr>
-              <w:t xml:space="preserve"> Br.</w:t>
-            </w:r>
-            <w:proofErr w:type="gramStart"/>
-            <w:r>
-              <w:rPr>
-                <w:lang w:val="en-US"/>
-              </w:rPr>
-              <w:t>],S</w:t>
-            </w:r>
-            <w:proofErr w:type="gramEnd"/>
-            <w:r>
-              <w:rPr>
-                <w:lang w:val="en-US"/>
-              </w:rPr>
-              <w:t>+|W-</w:t>
+              <w:t>Train Brake, [Release|Hold|Overlap /wo Feed|Overlap /w Feed|Small Service Br.|Service Br.|Emergency Br.],S+|W-</w:t>
             </w:r>
           </w:p>
         </w:tc>
@@ -6610,43 +6512,7 @@
               <w:rPr>
                 <w:lang w:val="en-US"/>
               </w:rPr>
-              <w:t>Rheostatic Brake, [</w:t>
-            </w:r>
-            <w:proofErr w:type="spellStart"/>
-            <w:proofErr w:type="gramStart"/>
-            <w:r>
-              <w:rPr>
-                <w:lang w:val="en-US"/>
-              </w:rPr>
-              <w:t>Off,Prepare</w:t>
-            </w:r>
-            <w:proofErr w:type="gramEnd"/>
-            <w:r>
-              <w:rPr>
-                <w:lang w:val="en-US"/>
-              </w:rPr>
-              <w:t>,Pre</w:t>
-            </w:r>
-            <w:proofErr w:type="spellEnd"/>
-            <w:r>
-              <w:rPr>
-                <w:lang w:val="en-US"/>
-              </w:rPr>
-              <w:t>-braking-&gt;Brake Position (Total X)],</w:t>
-            </w:r>
-            <w:proofErr w:type="spellStart"/>
-            <w:r>
-              <w:rPr>
-                <w:lang w:val="en-US"/>
-              </w:rPr>
-              <w:t>Up+,Down</w:t>
-            </w:r>
-            <w:proofErr w:type="spellEnd"/>
-            <w:r>
-              <w:rPr>
-                <w:lang w:val="en-US"/>
-              </w:rPr>
-              <w:t>-</w:t>
+              <w:t>Rheostatic Brake, [Off,Prepare,Pre-braking-&gt;Brake Position (Total X)],Up+,Down-</w:t>
             </w:r>
           </w:p>
         </w:tc>
@@ -6778,35 +6644,7 @@
               <w:rPr>
                 <w:lang w:val="en-US"/>
               </w:rPr>
-              <w:t>Increase Position of Main Controller [</w:t>
-            </w:r>
-            <w:proofErr w:type="spellStart"/>
-            <w:r>
-              <w:rPr>
-                <w:lang w:val="en-US"/>
-              </w:rPr>
-              <w:t>MS|Off|</w:t>
-            </w:r>
-            <w:proofErr w:type="gramStart"/>
-            <w:r>
-              <w:rPr>
-                <w:lang w:val="en-US"/>
-              </w:rPr>
-              <w:t>AD,MD</w:t>
-            </w:r>
-            <w:proofErr w:type="gramEnd"/>
-            <w:r>
-              <w:rPr>
-                <w:lang w:val="en-US"/>
-              </w:rPr>
-              <w:t>,FD,FI,MI,AI|Total</w:t>
-            </w:r>
-            <w:proofErr w:type="spellEnd"/>
-            <w:r>
-              <w:rPr>
-                <w:lang w:val="en-US"/>
-              </w:rPr>
-              <w:t xml:space="preserve"> 33 Thrust pos.]</w:t>
+              <w:t>Increase Position of Main Controller [MS|Off|AD,MD,FD,FI,MI,AI|Total 33 Thrust pos.]</w:t>
             </w:r>
           </w:p>
         </w:tc>
@@ -6849,35 +6687,7 @@
               <w:rPr>
                 <w:lang w:val="en-US"/>
               </w:rPr>
-              <w:t>Decrease Position of Main Controller [</w:t>
-            </w:r>
-            <w:proofErr w:type="spellStart"/>
-            <w:r>
-              <w:rPr>
-                <w:lang w:val="en-US"/>
-              </w:rPr>
-              <w:t>MS|Off|</w:t>
-            </w:r>
-            <w:proofErr w:type="gramStart"/>
-            <w:r>
-              <w:rPr>
-                <w:lang w:val="en-US"/>
-              </w:rPr>
-              <w:t>AD,MD</w:t>
-            </w:r>
-            <w:proofErr w:type="gramEnd"/>
-            <w:r>
-              <w:rPr>
-                <w:lang w:val="en-US"/>
-              </w:rPr>
-              <w:t>,FD,FI,MI,AI|Total</w:t>
-            </w:r>
-            <w:proofErr w:type="spellEnd"/>
-            <w:r>
-              <w:rPr>
-                <w:lang w:val="en-US"/>
-              </w:rPr>
-              <w:t xml:space="preserve"> 33 Thrust pos.]</w:t>
+              <w:t>Decrease Position of Main Controller [MS|Off|AD,MD,FD,FI,MI,AI|Total 33 Thrust pos.]</w:t>
             </w:r>
           </w:p>
         </w:tc>
@@ -6918,21 +6728,7 @@
               <w:rPr>
                 <w:lang w:val="en-US"/>
               </w:rPr>
-              <w:t xml:space="preserve">Main Tank Pressure, </w:t>
-            </w:r>
-            <w:proofErr w:type="spellStart"/>
-            <w:r>
-              <w:rPr>
-                <w:lang w:val="en-US"/>
-              </w:rPr>
-              <w:t>kgf</w:t>
-            </w:r>
-            <w:proofErr w:type="spellEnd"/>
-            <w:r>
-              <w:rPr>
-                <w:lang w:val="en-US"/>
-              </w:rPr>
-              <w:t>/cm2 [x]</w:t>
+              <w:t>Main Tank Pressure, kgf/cm2 [x]</w:t>
             </w:r>
           </w:p>
         </w:tc>
@@ -6975,21 +6771,7 @@
               <w:rPr>
                 <w:lang w:val="en-US"/>
               </w:rPr>
-              <w:t xml:space="preserve">Equalizing Tank Pressure, </w:t>
-            </w:r>
-            <w:proofErr w:type="spellStart"/>
-            <w:r>
-              <w:rPr>
-                <w:lang w:val="en-US"/>
-              </w:rPr>
-              <w:t>kgf</w:t>
-            </w:r>
-            <w:proofErr w:type="spellEnd"/>
-            <w:r>
-              <w:rPr>
-                <w:lang w:val="en-US"/>
-              </w:rPr>
-              <w:t>/cm2 [x]</w:t>
+              <w:t>Equalizing Tank Pressure, kgf/cm2 [x]</w:t>
             </w:r>
           </w:p>
         </w:tc>
@@ -7032,21 +6814,7 @@
               <w:rPr>
                 <w:lang w:val="en-US"/>
               </w:rPr>
-              <w:t xml:space="preserve">Brake Line Pressure, </w:t>
-            </w:r>
-            <w:proofErr w:type="spellStart"/>
-            <w:r>
-              <w:rPr>
-                <w:lang w:val="en-US"/>
-              </w:rPr>
-              <w:t>kgf</w:t>
-            </w:r>
-            <w:proofErr w:type="spellEnd"/>
-            <w:r>
-              <w:rPr>
-                <w:lang w:val="en-US"/>
-              </w:rPr>
-              <w:t>/cm2 [x]</w:t>
+              <w:t>Brake Line Pressure, kgf/cm2 [x]</w:t>
             </w:r>
           </w:p>
         </w:tc>
@@ -7089,21 +6857,7 @@
               <w:rPr>
                 <w:lang w:val="en-US"/>
               </w:rPr>
-              <w:t xml:space="preserve">Supply Tank Pressure, </w:t>
-            </w:r>
-            <w:proofErr w:type="spellStart"/>
-            <w:r>
-              <w:rPr>
-                <w:lang w:val="en-US"/>
-              </w:rPr>
-              <w:t>kgf</w:t>
-            </w:r>
-            <w:proofErr w:type="spellEnd"/>
-            <w:r>
-              <w:rPr>
-                <w:lang w:val="en-US"/>
-              </w:rPr>
-              <w:t>/cm2 [x]</w:t>
+              <w:t>Supply Tank Pressure, kgf/cm2 [x]</w:t>
             </w:r>
           </w:p>
         </w:tc>
@@ -7146,21 +6900,7 @@
               <w:rPr>
                 <w:lang w:val="en-US"/>
               </w:rPr>
-              <w:t xml:space="preserve">Brake Cylinder Pressure, </w:t>
-            </w:r>
-            <w:proofErr w:type="spellStart"/>
-            <w:r>
-              <w:rPr>
-                <w:lang w:val="en-US"/>
-              </w:rPr>
-              <w:t>kgf</w:t>
-            </w:r>
-            <w:proofErr w:type="spellEnd"/>
-            <w:r>
-              <w:rPr>
-                <w:lang w:val="en-US"/>
-              </w:rPr>
-              <w:t>/cm2 [x]</w:t>
+              <w:t>Brake Cylinder Pressure, kgf/cm2 [x]</w:t>
             </w:r>
           </w:p>
         </w:tc>
@@ -8625,27 +8365,15 @@
         <w:jc w:val="both"/>
       </w:pPr>
       <w:r>
-        <w:t>*Принципиальная схема с</w:t>
-      </w:r>
-      <w:r>
-        <w:t>верху</w:t>
-      </w:r>
-      <w:r>
-        <w:t>*</w:t>
-      </w:r>
-    </w:p>
-    <w:p>
-      <w:pPr>
-        <w:jc w:val="both"/>
-      </w:pPr>
-      <w:r>
-        <w:t>*Принципиальная схема с</w:t>
-      </w:r>
-      <w:r>
-        <w:t>боку</w:t>
-      </w:r>
-      <w:r>
-        <w:t>*</w:t>
+        <w:t>*Принципиальная схема сверху*</w:t>
+      </w:r>
+    </w:p>
+    <w:p>
+      <w:pPr>
+        <w:jc w:val="both"/>
+      </w:pPr>
+      <w:r>
+        <w:t>*Принципиальная схема сбоку*</w:t>
       </w:r>
     </w:p>
     <w:p>

</xml_diff>

<commit_message>
Auto update 07.08.2026 17:35:20,61
</commit_message>
<xml_diff>
--- a/Стандарт №3 проектирования железнодорожной техники в Stormworks Build&Rescue от 07.08.2026 г..docx
+++ b/Стандарт №3 проектирования железнодорожной техники в Stormworks Build&Rescue от 07.08.2026 г..docx
@@ -3397,6 +3397,17 @@
     <w:p>
       <w:pPr>
         <w:jc w:val="both"/>
+      </w:pPr>
+      <w:r>
+        <w:t>П</w:t>
+      </w:r>
+      <w:r>
+        <w:t>олучили широкое применение для магистральной грузовой и пассажирской работы, маневровой, вывозной и хозяйственной работы.</w:t>
+      </w:r>
+    </w:p>
+    <w:p>
+      <w:pPr>
+        <w:jc w:val="both"/>
         <w:rPr>
           <w:rFonts w:asciiTheme="majorHAnsi" w:eastAsiaTheme="majorEastAsia" w:hAnsiTheme="majorHAnsi" w:cstheme="majorBidi"/>
           <w:color w:val="0F4761" w:themeColor="accent1" w:themeShade="BF"/>
@@ -3405,10 +3416,13 @@
         </w:rPr>
       </w:pPr>
       <w:r>
-        <w:t>П</w:t>
-      </w:r>
-      <w:r>
-        <w:t>олучили широкое применение для магистральной грузовой и пассажирской работы, маневровой, вывозной и хозяйственной работы.</w:t>
+        <w:t>*</w:t>
+      </w:r>
+      <w:r>
+        <w:t>Добавить фото для разнообразия</w:t>
+      </w:r>
+      <w:r>
+        <w:t>*</w:t>
       </w:r>
     </w:p>
     <w:p>
@@ -3488,10 +3502,44 @@
     </w:p>
     <w:p>
       <w:pPr>
+        <w:jc w:val="both"/>
+      </w:pPr>
+      <w:r>
+        <w:t>*Добавить принципиальную схему*</w:t>
+      </w:r>
+    </w:p>
+    <w:p>
+      <w:pPr>
+        <w:jc w:val="both"/>
+        <w:rPr>
+          <w:rFonts w:asciiTheme="majorHAnsi" w:eastAsiaTheme="majorEastAsia" w:hAnsiTheme="majorHAnsi" w:cstheme="majorBidi"/>
+          <w:color w:val="0F4761" w:themeColor="accent1" w:themeShade="BF"/>
+          <w:sz w:val="32"/>
+          <w:szCs w:val="32"/>
+        </w:rPr>
+      </w:pPr>
+      <w:r>
+        <w:t>*</w:t>
+      </w:r>
+      <w:r>
+        <w:t>Добавить фото для разнообразия</w:t>
+      </w:r>
+      <w:r>
+        <w:t>*</w:t>
+      </w:r>
+    </w:p>
+    <w:p>
+      <w:pPr>
+        <w:jc w:val="both"/>
+      </w:pPr>
+    </w:p>
+    <w:p>
+      <w:pPr>
         <w:pStyle w:val="3"/>
       </w:pPr>
       <w:bookmarkStart w:id="3" w:name="_Toc237014878"/>
       <w:r>
+        <w:lastRenderedPageBreak/>
         <w:t>Тепловозы с г</w:t>
       </w:r>
       <w:r>
@@ -3519,11 +3567,7 @@
         <w:t xml:space="preserve"> </w:t>
       </w:r>
       <w:r>
-        <w:t xml:space="preserve">Гидродинамический преобразователь позволяет осуществлять плавную передачу мощности при трогании </w:t>
-      </w:r>
-      <w:r>
-        <w:lastRenderedPageBreak/>
-        <w:t>и изменении скорости, снижая необходимость использования обычного фрикционного сцепления при больших тяговых нагрузках.</w:t>
+        <w:t>Гидродинамический преобразователь позволяет осуществлять плавную передачу мощности при трогании и изменении скорости, снижая необходимость использования обычного фрикционного сцепления при больших тяговых нагрузках.</w:t>
       </w:r>
     </w:p>
     <w:p>
@@ -3563,6 +3607,28 @@
       </w:r>
       <w:r>
         <w:t>ля машиниста управление обычно проще благодаря автоматизированному или полуавтоматическому переключению ступеней.</w:t>
+      </w:r>
+    </w:p>
+    <w:p>
+      <w:pPr>
+        <w:jc w:val="both"/>
+      </w:pPr>
+      <w:r>
+        <w:t>*Добавить принципиальную схему*</w:t>
+      </w:r>
+    </w:p>
+    <w:p>
+      <w:pPr>
+        <w:jc w:val="both"/>
+      </w:pPr>
+      <w:r>
+        <w:t>*</w:t>
+      </w:r>
+      <w:r>
+        <w:t>Добавить фото для разнообразия</w:t>
+      </w:r>
+      <w:r>
+        <w:t>*</w:t>
       </w:r>
     </w:p>
     <w:p>
@@ -3626,6 +3692,7 @@
         <w:jc w:val="both"/>
       </w:pPr>
       <w:r>
+        <w:lastRenderedPageBreak/>
         <w:t>По сравнению с механической и гидромеханической передачами электрическая система конструктивно сложнее</w:t>
       </w:r>
       <w:r>
@@ -3658,11 +3725,32 @@
     </w:p>
     <w:p>
       <w:pPr>
+        <w:jc w:val="both"/>
+      </w:pPr>
+      <w:r>
+        <w:t>*Добавить принципиальную схему*</w:t>
+      </w:r>
+    </w:p>
+    <w:p>
+      <w:pPr>
+        <w:jc w:val="both"/>
+      </w:pPr>
+      <w:r>
+        <w:t>*</w:t>
+      </w:r>
+      <w:r>
+        <w:t>Добавить фото для разнообразия</w:t>
+      </w:r>
+      <w:r>
+        <w:t>*</w:t>
+      </w:r>
+    </w:p>
+    <w:p>
+      <w:pPr>
         <w:pStyle w:val="2"/>
       </w:pPr>
       <w:bookmarkStart w:id="5" w:name="_Toc237014880"/>
       <w:r>
-        <w:lastRenderedPageBreak/>
         <w:t>Газотурбовозы</w:t>
       </w:r>
       <w:bookmarkEnd w:id="5"/>
@@ -3704,6 +3792,28 @@
       </w:r>
       <w:r>
         <w:t xml:space="preserve">. </w:t>
+      </w:r>
+    </w:p>
+    <w:p>
+      <w:pPr>
+        <w:jc w:val="both"/>
+      </w:pPr>
+      <w:r>
+        <w:t>*Добавить принципиальную схему*</w:t>
+      </w:r>
+    </w:p>
+    <w:p>
+      <w:pPr>
+        <w:jc w:val="both"/>
+      </w:pPr>
+      <w:r>
+        <w:t>*</w:t>
+      </w:r>
+      <w:r>
+        <w:t>Добавить фото для разнообразия</w:t>
+      </w:r>
+      <w:r>
+        <w:t>*</w:t>
       </w:r>
     </w:p>
     <w:p>
@@ -3773,6 +3883,17 @@
     <w:p>
       <w:pPr>
         <w:jc w:val="both"/>
+      </w:pPr>
+      <w:r>
+        <w:t>Эксплуатационно электровоз сложнее по электрическому оборудованию и требованиям безопасности, чем дизельный локомотив</w:t>
+      </w:r>
+      <w:r>
+        <w:t>.</w:t>
+      </w:r>
+    </w:p>
+    <w:p>
+      <w:pPr>
+        <w:jc w:val="both"/>
         <w:rPr>
           <w:rFonts w:asciiTheme="majorHAnsi" w:eastAsiaTheme="majorEastAsia" w:hAnsiTheme="majorHAnsi" w:cstheme="majorBidi"/>
           <w:color w:val="0F4761" w:themeColor="accent1" w:themeShade="BF"/>
@@ -3781,10 +3902,13 @@
         </w:rPr>
       </w:pPr>
       <w:r>
-        <w:t>Эксплуатационно электровоз сложнее по электрическому оборудованию и требованиям безопасности, чем дизельный локомотив</w:t>
-      </w:r>
-      <w:r>
-        <w:t>.</w:t>
+        <w:t>*</w:t>
+      </w:r>
+      <w:r>
+        <w:t>Добавить фото для разнообразия</w:t>
+      </w:r>
+      <w:r>
+        <w:t>*</w:t>
       </w:r>
     </w:p>
     <w:p>
@@ -3856,6 +3980,28 @@
     </w:p>
     <w:p>
       <w:pPr>
+        <w:jc w:val="both"/>
+      </w:pPr>
+      <w:r>
+        <w:t>*Добавить принципиальную схему*</w:t>
+      </w:r>
+    </w:p>
+    <w:p>
+      <w:pPr>
+        <w:jc w:val="both"/>
+      </w:pPr>
+      <w:r>
+        <w:t>*</w:t>
+      </w:r>
+      <w:r>
+        <w:t>Добавить фото для разнообразия</w:t>
+      </w:r>
+      <w:r>
+        <w:t>*</w:t>
+      </w:r>
+    </w:p>
+    <w:p>
+      <w:pPr>
         <w:pStyle w:val="3"/>
       </w:pPr>
       <w:bookmarkStart w:id="8" w:name="_Toc237014883"/>
@@ -3911,6 +4057,28 @@
       </w:pPr>
       <w:r>
         <w:t>Основным эксплуатационным ограничением является зависимость от контактной сети: при отсутствии электрификации либо при невозможности её использования сетевой электровоз не способен самостоятельно выполнять обычную тяговую работу, что и является тем маленьким, но весьма принципиальным недостатком, который инфраструктура обычно старается не забывать.</w:t>
+      </w:r>
+    </w:p>
+    <w:p>
+      <w:pPr>
+        <w:jc w:val="both"/>
+      </w:pPr>
+      <w:r>
+        <w:t>*Добавить принципиальную схему*</w:t>
+      </w:r>
+    </w:p>
+    <w:p>
+      <w:pPr>
+        <w:jc w:val="both"/>
+      </w:pPr>
+      <w:r>
+        <w:t>*</w:t>
+      </w:r>
+      <w:r>
+        <w:t>Добавить фото для разнообразия</w:t>
+      </w:r>
+      <w:r>
+        <w:t>*</w:t>
       </w:r>
     </w:p>
     <w:p>
@@ -3949,6 +4117,14 @@
     <w:p>
       <w:pPr>
         <w:jc w:val="both"/>
+      </w:pPr>
+      <w:r>
+        <w:t xml:space="preserve">Паровозы – это локомотив, который преобразовывает химическую энергию топлива в тепловую, которую затем преобразовывает в движение. </w:t>
+      </w:r>
+    </w:p>
+    <w:p>
+      <w:pPr>
+        <w:jc w:val="both"/>
         <w:rPr>
           <w:rFonts w:asciiTheme="majorHAnsi" w:eastAsiaTheme="majorEastAsia" w:hAnsiTheme="majorHAnsi" w:cstheme="majorBidi"/>
           <w:color w:val="0F4761" w:themeColor="accent1" w:themeShade="BF"/>
@@ -3957,7 +4133,13 @@
         </w:rPr>
       </w:pPr>
       <w:r>
-        <w:t xml:space="preserve">Паровозы – это локомотив, который преобразовывает химическую энергию топлива в тепловую, которую затем преобразовывает в движение. </w:t>
+        <w:t>*</w:t>
+      </w:r>
+      <w:r>
+        <w:t>Добавить фото для разнообразия</w:t>
+      </w:r>
+      <w:r>
+        <w:t>*</w:t>
       </w:r>
     </w:p>
     <w:p>
@@ -4026,6 +4208,28 @@
     </w:p>
     <w:p>
       <w:pPr>
+        <w:jc w:val="both"/>
+      </w:pPr>
+      <w:r>
+        <w:t>*Добавить принципиальную схему*</w:t>
+      </w:r>
+    </w:p>
+    <w:p>
+      <w:pPr>
+        <w:jc w:val="both"/>
+      </w:pPr>
+      <w:r>
+        <w:t>*</w:t>
+      </w:r>
+      <w:r>
+        <w:t>Добавить фото для разнообразия</w:t>
+      </w:r>
+      <w:r>
+        <w:t>*</w:t>
+      </w:r>
+    </w:p>
+    <w:p>
+      <w:pPr>
         <w:pStyle w:val="3"/>
       </w:pPr>
       <w:bookmarkStart w:id="11" w:name="_Toc237014886"/>
@@ -4066,15 +4270,34 @@
         <w:jc w:val="both"/>
       </w:pPr>
       <w:r>
+        <w:lastRenderedPageBreak/>
         <w:t>Турбина особенно эффективна при высоких скоростях вращения и устойчивой нагрузке, однако непосредственная передача её высокой частоты вращения на колёса требует специальной механической либо электрической передачи.</w:t>
       </w:r>
       <w:r>
         <w:br/>
-        <w:t xml:space="preserve">Несмотря на потенциальные преимущества по плавности работы и возможности </w:t>
-      </w:r>
-      <w:r>
-        <w:lastRenderedPageBreak/>
-        <w:t xml:space="preserve">повышения эффективности, паротурбовозы не получили значительного распространения на железных дорогах из-за сложности установки, проблем работы на переменных режимах и недостаточной экономической эффективности всей системы. </w:t>
+        <w:t xml:space="preserve">Несмотря на потенциальные преимущества по плавности работы и возможности повышения эффективности, паротурбовозы не получили значительного распространения на железных дорогах из-за сложности установки, проблем работы на переменных режимах и недостаточной экономической эффективности всей системы. </w:t>
+      </w:r>
+    </w:p>
+    <w:p>
+      <w:pPr>
+        <w:jc w:val="both"/>
+      </w:pPr>
+      <w:r>
+        <w:t>*Добавить принципиальную схему*</w:t>
+      </w:r>
+    </w:p>
+    <w:p>
+      <w:pPr>
+        <w:jc w:val="both"/>
+      </w:pPr>
+      <w:r>
+        <w:t>*</w:t>
+      </w:r>
+      <w:r>
+        <w:t>Добавить фото для разнообразия</w:t>
+      </w:r>
+      <w:r>
+        <w:t>*</w:t>
       </w:r>
     </w:p>
     <w:p>
@@ -5310,13 +5533,7 @@
         <w:t>Пассажирские локомотивы и вагоны в обязательном порядке должны оснащаться ЭПТ</w:t>
       </w:r>
       <w:r>
-        <w:t xml:space="preserve">; </w:t>
-      </w:r>
-      <w:r>
-        <w:t>Установка ЭПТ на грузовые вагоны и локомотивы допускается, но не обязательна</w:t>
-      </w:r>
-      <w:r>
-        <w:t>.</w:t>
+        <w:t>;</w:t>
       </w:r>
     </w:p>
     <w:p>
@@ -5634,22 +5851,22 @@
         <w:jc w:val="both"/>
       </w:pPr>
       <w:r>
+        <w:t>Клапана 9 –</w:t>
+      </w:r>
+      <w:r>
+        <w:t xml:space="preserve"> </w:t>
+      </w:r>
+      <w:r>
+        <w:t>численный клапан между ПМ и ТЦ</w:t>
+      </w:r>
+    </w:p>
+    <w:p>
+      <w:pPr>
+        <w:pStyle w:val="2"/>
+      </w:pPr>
+      <w:bookmarkStart w:id="15" w:name="_Toc237014890"/>
+      <w:r>
         <w:lastRenderedPageBreak/>
-        <w:t>Клапана 9 –</w:t>
-      </w:r>
-      <w:r>
-        <w:t xml:space="preserve"> </w:t>
-      </w:r>
-      <w:r>
-        <w:t>численный клапан между ПМ и ТЦ</w:t>
-      </w:r>
-    </w:p>
-    <w:p>
-      <w:pPr>
-        <w:pStyle w:val="2"/>
-      </w:pPr>
-      <w:bookmarkStart w:id="15" w:name="_Toc237014890"/>
-      <w:r>
         <w:t>Управление и контроллеры</w:t>
       </w:r>
       <w:bookmarkEnd w:id="15"/>
@@ -6525,7 +6742,6 @@
           </w:tcPr>
           <w:p>
             <w:r>
-              <w:lastRenderedPageBreak/>
               <w:t>Тяговая ось</w:t>
             </w:r>
           </w:p>
@@ -10916,7 +11132,7 @@
   <w:style w:type="paragraph" w:default="1" w:styleId="a">
     <w:name w:val="Normal"/>
     <w:qFormat/>
-    <w:rsid w:val="00C37E18"/>
+    <w:rsid w:val="009114C0"/>
   </w:style>
   <w:style w:type="paragraph" w:styleId="1">
     <w:name w:val="heading 1"/>

</xml_diff>

<commit_message>
Auto update 10.08.2026 16:10:04,94
</commit_message>
<xml_diff>
--- a/Стандарт №3 проектирования железнодорожной техники в Stormworks Build&Rescue от 07.08.2026 г..docx
+++ b/Стандарт №3 проектирования железнодорожной техники в Stormworks Build&Rescue от 07.08.2026 г..docx
@@ -4330,6 +4330,8 @@
         <w:pStyle w:val="2"/>
       </w:pPr>
       <w:bookmarkStart w:id="13" w:name="_Toc237014888"/>
+      <w:bookmarkStart w:id="14" w:name="_Условные_обозначения"/>
+      <w:bookmarkEnd w:id="14"/>
       <w:r>
         <w:t>Условные обозначения</w:t>
       </w:r>
@@ -4999,6 +5001,47 @@
     </w:p>
     <w:p>
       <w:pPr>
+        <w:pStyle w:val="a7"/>
+        <w:numPr>
+          <w:ilvl w:val="0"/>
+          <w:numId w:val="9"/>
+        </w:numPr>
+        <w:jc w:val="both"/>
+      </w:pPr>
+      <w:r>
+        <w:t>КМ394</w:t>
+      </w:r>
+      <w:r>
+        <w:t>/</w:t>
+      </w:r>
+      <w:r>
+        <w:t xml:space="preserve">КМ395 – Кран Машиниста усл. №394 (без ЭПТ) </w:t>
+      </w:r>
+      <w:r>
+        <w:rPr>
+          <w:lang w:val="en-US"/>
+        </w:rPr>
+        <w:t>/</w:t>
+      </w:r>
+      <w:r>
+        <w:t xml:space="preserve"> №395 (с ЭПТ)</w:t>
+      </w:r>
+    </w:p>
+    <w:p>
+      <w:pPr>
+        <w:pStyle w:val="a7"/>
+        <w:numPr>
+          <w:ilvl w:val="0"/>
+          <w:numId w:val="9"/>
+        </w:numPr>
+        <w:jc w:val="both"/>
+      </w:pPr>
+      <w:r>
+        <w:t>КВТ254 – Кран Вспомогательный Тормозной усл. №254 (локомотивный)</w:t>
+      </w:r>
+    </w:p>
+    <w:p>
+      <w:pPr>
         <w:rPr>
           <w:rFonts w:asciiTheme="majorHAnsi" w:eastAsiaTheme="majorEastAsia" w:hAnsiTheme="majorHAnsi" w:cstheme="majorBidi"/>
           <w:color w:val="0F4761" w:themeColor="accent1" w:themeShade="BF"/>
@@ -5014,12 +5057,14 @@
       <w:pPr>
         <w:pStyle w:val="2"/>
       </w:pPr>
-      <w:bookmarkStart w:id="14" w:name="_Toc237014889"/>
+      <w:bookmarkStart w:id="15" w:name="_Toc237014889"/>
+      <w:bookmarkStart w:id="16" w:name="_Пневматическое_оборудование"/>
+      <w:bookmarkEnd w:id="16"/>
       <w:r>
         <w:lastRenderedPageBreak/>
         <w:t>Пневматическое оборудование</w:t>
       </w:r>
-      <w:bookmarkEnd w:id="14"/>
+      <w:bookmarkEnd w:id="15"/>
     </w:p>
     <w:p>
       <w:pPr>
@@ -5864,12 +5909,12 @@
       <w:pPr>
         <w:pStyle w:val="2"/>
       </w:pPr>
-      <w:bookmarkStart w:id="15" w:name="_Toc237014890"/>
+      <w:bookmarkStart w:id="17" w:name="_Toc237014890"/>
       <w:r>
         <w:lastRenderedPageBreak/>
         <w:t>Управление и контроллеры</w:t>
       </w:r>
-      <w:bookmarkEnd w:id="15"/>
+      <w:bookmarkEnd w:id="17"/>
     </w:p>
     <w:p>
       <w:pPr>
@@ -6011,11 +6056,11 @@
       <w:pPr>
         <w:pStyle w:val="2"/>
       </w:pPr>
-      <w:bookmarkStart w:id="16" w:name="_Toc237014891"/>
+      <w:bookmarkStart w:id="18" w:name="_Toc237014891"/>
       <w:r>
         <w:t>Электропитание ключевых систем и тепловозная тяга</w:t>
       </w:r>
-      <w:bookmarkEnd w:id="16"/>
+      <w:bookmarkEnd w:id="18"/>
     </w:p>
     <w:p>
       <w:pPr>
@@ -6240,12 +6285,12 @@
       <w:pPr>
         <w:pStyle w:val="2"/>
       </w:pPr>
-      <w:bookmarkStart w:id="17" w:name="_Toc237014892"/>
+      <w:bookmarkStart w:id="19" w:name="_Toc237014892"/>
       <w:r>
         <w:lastRenderedPageBreak/>
         <w:t>Доступность</w:t>
       </w:r>
-      <w:bookmarkEnd w:id="17"/>
+      <w:bookmarkEnd w:id="19"/>
     </w:p>
     <w:p>
       <w:pPr>
@@ -6328,11 +6373,11 @@
       <w:pPr>
         <w:pStyle w:val="2"/>
       </w:pPr>
-      <w:bookmarkStart w:id="18" w:name="_Toc237014893"/>
+      <w:bookmarkStart w:id="20" w:name="_Toc237014893"/>
       <w:r>
         <w:t>Конструкция</w:t>
       </w:r>
-      <w:bookmarkEnd w:id="18"/>
+      <w:bookmarkEnd w:id="20"/>
     </w:p>
     <w:p>
       <w:pPr>
@@ -6370,11 +6415,11 @@
       <w:pPr>
         <w:pStyle w:val="2"/>
       </w:pPr>
-      <w:bookmarkStart w:id="19" w:name="_Toc237014894"/>
+      <w:bookmarkStart w:id="21" w:name="_Toc237014894"/>
       <w:r>
         <w:t>Инвентарь</w:t>
       </w:r>
-      <w:bookmarkEnd w:id="19"/>
+      <w:bookmarkEnd w:id="21"/>
     </w:p>
     <w:p>
       <w:pPr>
@@ -6471,11 +6516,11 @@
       <w:pPr>
         <w:pStyle w:val="2"/>
       </w:pPr>
-      <w:bookmarkStart w:id="20" w:name="_Toc237014895"/>
+      <w:bookmarkStart w:id="22" w:name="_Toc237014895"/>
       <w:r>
         <w:t>Названия</w:t>
       </w:r>
-      <w:bookmarkEnd w:id="20"/>
+      <w:bookmarkEnd w:id="22"/>
     </w:p>
     <w:p>
       <w:pPr>
@@ -6641,7 +6686,29 @@
               <w:rPr>
                 <w:lang w:val="en-US"/>
               </w:rPr>
-              <w:t>Independent Brake, [Release|Hold|I-IV],A+|D-</w:t>
+              <w:t>Independent Brake, [</w:t>
+            </w:r>
+            <w:proofErr w:type="spellStart"/>
+            <w:r>
+              <w:rPr>
+                <w:lang w:val="en-US"/>
+              </w:rPr>
+              <w:t>Release|Hold|I-IV</w:t>
+            </w:r>
+            <w:proofErr w:type="spellEnd"/>
+            <w:proofErr w:type="gramStart"/>
+            <w:r>
+              <w:rPr>
+                <w:lang w:val="en-US"/>
+              </w:rPr>
+              <w:t>],A</w:t>
+            </w:r>
+            <w:proofErr w:type="gramEnd"/>
+            <w:r>
+              <w:rPr>
+                <w:lang w:val="en-US"/>
+              </w:rPr>
+              <w:t>+|D-</w:t>
             </w:r>
           </w:p>
         </w:tc>
@@ -6684,7 +6751,91 @@
               <w:rPr>
                 <w:lang w:val="en-US"/>
               </w:rPr>
-              <w:t>Train Brake, [Release|Hold|Overlap /wo Feed|Overlap /w Feed|Small Service Br.|Service Br.|Emergency Br.],S+|W-</w:t>
+              <w:t>Train Brake, [</w:t>
+            </w:r>
+            <w:proofErr w:type="spellStart"/>
+            <w:r>
+              <w:rPr>
+                <w:lang w:val="en-US"/>
+              </w:rPr>
+              <w:t>Release|Hold|Overlap</w:t>
+            </w:r>
+            <w:proofErr w:type="spellEnd"/>
+            <w:r>
+              <w:rPr>
+                <w:lang w:val="en-US"/>
+              </w:rPr>
+              <w:t xml:space="preserve"> /wo </w:t>
+            </w:r>
+            <w:proofErr w:type="spellStart"/>
+            <w:r>
+              <w:rPr>
+                <w:lang w:val="en-US"/>
+              </w:rPr>
+              <w:t>Feed|Overlap</w:t>
+            </w:r>
+            <w:proofErr w:type="spellEnd"/>
+            <w:r>
+              <w:rPr>
+                <w:lang w:val="en-US"/>
+              </w:rPr>
+              <w:t xml:space="preserve"> /w </w:t>
+            </w:r>
+            <w:proofErr w:type="spellStart"/>
+            <w:r>
+              <w:rPr>
+                <w:lang w:val="en-US"/>
+              </w:rPr>
+              <w:t>Feed|Small</w:t>
+            </w:r>
+            <w:proofErr w:type="spellEnd"/>
+            <w:r>
+              <w:rPr>
+                <w:lang w:val="en-US"/>
+              </w:rPr>
+              <w:t xml:space="preserve"> Service </w:t>
+            </w:r>
+            <w:proofErr w:type="spellStart"/>
+            <w:r>
+              <w:rPr>
+                <w:lang w:val="en-US"/>
+              </w:rPr>
+              <w:t>Br.|Service</w:t>
+            </w:r>
+            <w:proofErr w:type="spellEnd"/>
+            <w:r>
+              <w:rPr>
+                <w:lang w:val="en-US"/>
+              </w:rPr>
+              <w:t xml:space="preserve"> </w:t>
+            </w:r>
+            <w:proofErr w:type="spellStart"/>
+            <w:r>
+              <w:rPr>
+                <w:lang w:val="en-US"/>
+              </w:rPr>
+              <w:t>Br.|Emergency</w:t>
+            </w:r>
+            <w:proofErr w:type="spellEnd"/>
+            <w:r>
+              <w:rPr>
+                <w:lang w:val="en-US"/>
+              </w:rPr>
+              <w:t xml:space="preserve"> Br.</w:t>
+            </w:r>
+            <w:proofErr w:type="gramStart"/>
+            <w:r>
+              <w:rPr>
+                <w:lang w:val="en-US"/>
+              </w:rPr>
+              <w:t>],S</w:t>
+            </w:r>
+            <w:proofErr w:type="gramEnd"/>
+            <w:r>
+              <w:rPr>
+                <w:lang w:val="en-US"/>
+              </w:rPr>
+              <w:t>+|W-</w:t>
             </w:r>
           </w:p>
         </w:tc>
@@ -6729,7 +6880,43 @@
               <w:rPr>
                 <w:lang w:val="en-US"/>
               </w:rPr>
-              <w:t>Rheostatic Brake, [Off,Prepare,Pre-braking-&gt;Brake Position (Total X)],Up+,Down-</w:t>
+              <w:t>Rheostatic Brake, [</w:t>
+            </w:r>
+            <w:proofErr w:type="spellStart"/>
+            <w:proofErr w:type="gramStart"/>
+            <w:r>
+              <w:rPr>
+                <w:lang w:val="en-US"/>
+              </w:rPr>
+              <w:t>Off,Prepare</w:t>
+            </w:r>
+            <w:proofErr w:type="gramEnd"/>
+            <w:r>
+              <w:rPr>
+                <w:lang w:val="en-US"/>
+              </w:rPr>
+              <w:t>,Pre</w:t>
+            </w:r>
+            <w:proofErr w:type="spellEnd"/>
+            <w:r>
+              <w:rPr>
+                <w:lang w:val="en-US"/>
+              </w:rPr>
+              <w:t>-braking-&gt;Brake Position (Total X)],</w:t>
+            </w:r>
+            <w:proofErr w:type="spellStart"/>
+            <w:r>
+              <w:rPr>
+                <w:lang w:val="en-US"/>
+              </w:rPr>
+              <w:t>Up+,Down</w:t>
+            </w:r>
+            <w:proofErr w:type="spellEnd"/>
+            <w:r>
+              <w:rPr>
+                <w:lang w:val="en-US"/>
+              </w:rPr>
+              <w:t>-</w:t>
             </w:r>
           </w:p>
         </w:tc>
@@ -6860,7 +7047,35 @@
               <w:rPr>
                 <w:lang w:val="en-US"/>
               </w:rPr>
-              <w:t>Increase Position of Main Controller [MS|Off|AD,MD,FD,FI,MI,AI|Total 33 Thrust pos.]</w:t>
+              <w:t>Increase Position of Main Controller [</w:t>
+            </w:r>
+            <w:proofErr w:type="spellStart"/>
+            <w:r>
+              <w:rPr>
+                <w:lang w:val="en-US"/>
+              </w:rPr>
+              <w:t>MS|Off|</w:t>
+            </w:r>
+            <w:proofErr w:type="gramStart"/>
+            <w:r>
+              <w:rPr>
+                <w:lang w:val="en-US"/>
+              </w:rPr>
+              <w:t>AD,MD</w:t>
+            </w:r>
+            <w:proofErr w:type="gramEnd"/>
+            <w:r>
+              <w:rPr>
+                <w:lang w:val="en-US"/>
+              </w:rPr>
+              <w:t>,FD,FI,MI,AI|Total</w:t>
+            </w:r>
+            <w:proofErr w:type="spellEnd"/>
+            <w:r>
+              <w:rPr>
+                <w:lang w:val="en-US"/>
+              </w:rPr>
+              <w:t xml:space="preserve"> 33 Thrust pos.]</w:t>
             </w:r>
           </w:p>
         </w:tc>
@@ -6903,7 +7118,35 @@
               <w:rPr>
                 <w:lang w:val="en-US"/>
               </w:rPr>
-              <w:t>Decrease Position of Main Controller [MS|Off|AD,MD,FD,FI,MI,AI|Total 33 Thrust pos.]</w:t>
+              <w:t>Decrease Position of Main Controller [</w:t>
+            </w:r>
+            <w:proofErr w:type="spellStart"/>
+            <w:r>
+              <w:rPr>
+                <w:lang w:val="en-US"/>
+              </w:rPr>
+              <w:t>MS|Off|</w:t>
+            </w:r>
+            <w:proofErr w:type="gramStart"/>
+            <w:r>
+              <w:rPr>
+                <w:lang w:val="en-US"/>
+              </w:rPr>
+              <w:t>AD,MD</w:t>
+            </w:r>
+            <w:proofErr w:type="gramEnd"/>
+            <w:r>
+              <w:rPr>
+                <w:lang w:val="en-US"/>
+              </w:rPr>
+              <w:t>,FD,FI,MI,AI|Total</w:t>
+            </w:r>
+            <w:proofErr w:type="spellEnd"/>
+            <w:r>
+              <w:rPr>
+                <w:lang w:val="en-US"/>
+              </w:rPr>
+              <w:t xml:space="preserve"> 33 Thrust pos.]</w:t>
             </w:r>
           </w:p>
         </w:tc>
@@ -6944,7 +7187,21 @@
               <w:rPr>
                 <w:lang w:val="en-US"/>
               </w:rPr>
-              <w:t>Main Tank Pressure, kgf/cm2 [x]</w:t>
+              <w:t xml:space="preserve">Main Tank Pressure, </w:t>
+            </w:r>
+            <w:proofErr w:type="spellStart"/>
+            <w:r>
+              <w:rPr>
+                <w:lang w:val="en-US"/>
+              </w:rPr>
+              <w:t>kgf</w:t>
+            </w:r>
+            <w:proofErr w:type="spellEnd"/>
+            <w:r>
+              <w:rPr>
+                <w:lang w:val="en-US"/>
+              </w:rPr>
+              <w:t>/cm2 [x]</w:t>
             </w:r>
           </w:p>
         </w:tc>
@@ -6987,7 +7244,21 @@
               <w:rPr>
                 <w:lang w:val="en-US"/>
               </w:rPr>
-              <w:t>Equalizing Tank Pressure, kgf/cm2 [x]</w:t>
+              <w:t xml:space="preserve">Equalizing Tank Pressure, </w:t>
+            </w:r>
+            <w:proofErr w:type="spellStart"/>
+            <w:r>
+              <w:rPr>
+                <w:lang w:val="en-US"/>
+              </w:rPr>
+              <w:t>kgf</w:t>
+            </w:r>
+            <w:proofErr w:type="spellEnd"/>
+            <w:r>
+              <w:rPr>
+                <w:lang w:val="en-US"/>
+              </w:rPr>
+              <w:t>/cm2 [x]</w:t>
             </w:r>
           </w:p>
         </w:tc>
@@ -7030,7 +7301,21 @@
               <w:rPr>
                 <w:lang w:val="en-US"/>
               </w:rPr>
-              <w:t>Brake Line Pressure, kgf/cm2 [x]</w:t>
+              <w:t xml:space="preserve">Brake Line Pressure, </w:t>
+            </w:r>
+            <w:proofErr w:type="spellStart"/>
+            <w:r>
+              <w:rPr>
+                <w:lang w:val="en-US"/>
+              </w:rPr>
+              <w:t>kgf</w:t>
+            </w:r>
+            <w:proofErr w:type="spellEnd"/>
+            <w:r>
+              <w:rPr>
+                <w:lang w:val="en-US"/>
+              </w:rPr>
+              <w:t>/cm2 [x]</w:t>
             </w:r>
           </w:p>
         </w:tc>
@@ -7073,7 +7358,21 @@
               <w:rPr>
                 <w:lang w:val="en-US"/>
               </w:rPr>
-              <w:t>Supply Tank Pressure, kgf/cm2 [x]</w:t>
+              <w:t xml:space="preserve">Supply Tank Pressure, </w:t>
+            </w:r>
+            <w:proofErr w:type="spellStart"/>
+            <w:r>
+              <w:rPr>
+                <w:lang w:val="en-US"/>
+              </w:rPr>
+              <w:t>kgf</w:t>
+            </w:r>
+            <w:proofErr w:type="spellEnd"/>
+            <w:r>
+              <w:rPr>
+                <w:lang w:val="en-US"/>
+              </w:rPr>
+              <w:t>/cm2 [x]</w:t>
             </w:r>
           </w:p>
         </w:tc>
@@ -7116,7 +7415,21 @@
               <w:rPr>
                 <w:lang w:val="en-US"/>
               </w:rPr>
-              <w:t>Brake Cylinder Pressure, kgf/cm2 [x]</w:t>
+              <w:t xml:space="preserve">Brake Cylinder Pressure, </w:t>
+            </w:r>
+            <w:proofErr w:type="spellStart"/>
+            <w:r>
+              <w:rPr>
+                <w:lang w:val="en-US"/>
+              </w:rPr>
+              <w:t>kgf</w:t>
+            </w:r>
+            <w:proofErr w:type="spellEnd"/>
+            <w:r>
+              <w:rPr>
+                <w:lang w:val="en-US"/>
+              </w:rPr>
+              <w:t>/cm2 [x]</w:t>
             </w:r>
           </w:p>
         </w:tc>
@@ -7324,11 +7637,11 @@
       <w:pPr>
         <w:pStyle w:val="2"/>
       </w:pPr>
-      <w:bookmarkStart w:id="21" w:name="_Toc237014896"/>
+      <w:bookmarkStart w:id="23" w:name="_Toc237014896"/>
       <w:r>
         <w:t>Тяга</w:t>
       </w:r>
-      <w:bookmarkEnd w:id="21"/>
+      <w:bookmarkEnd w:id="23"/>
     </w:p>
     <w:p>
       <w:pPr>
@@ -7407,7 +7720,7 @@
           <w:spacing w:val="100"/>
         </w:rPr>
       </w:pPr>
-      <w:bookmarkStart w:id="22" w:name="_Toc237014897"/>
+      <w:bookmarkStart w:id="24" w:name="_Toc237014897"/>
       <w:r>
         <w:rPr>
           <w:caps/>
@@ -7416,13 +7729,124 @@
         <w:lastRenderedPageBreak/>
         <w:t>Микроконтроллеры</w:t>
       </w:r>
-      <w:bookmarkEnd w:id="22"/>
+      <w:bookmarkEnd w:id="24"/>
+    </w:p>
+    <w:p>
+      <w:pPr>
+        <w:jc w:val="both"/>
+        <w:rPr>
+          <w:sz w:val="28"/>
+          <w:szCs w:val="28"/>
+        </w:rPr>
+      </w:pPr>
+      <w:r>
+        <w:rPr>
+          <w:sz w:val="28"/>
+          <w:szCs w:val="28"/>
+        </w:rPr>
+        <w:t xml:space="preserve">Описываться </w:t>
+      </w:r>
+      <w:r>
+        <w:rPr>
+          <w:sz w:val="28"/>
+          <w:szCs w:val="28"/>
+        </w:rPr>
+        <w:t>ноды</w:t>
+      </w:r>
+      <w:r>
+        <w:rPr>
+          <w:sz w:val="28"/>
+          <w:szCs w:val="28"/>
+        </w:rPr>
+        <w:t xml:space="preserve"> микроконтроллеров будут построчно, слева направо, сверху вниз.</w:t>
+      </w:r>
+    </w:p>
+    <w:p>
+      <w:pPr>
+        <w:jc w:val="both"/>
+        <w:rPr>
+          <w:sz w:val="28"/>
+          <w:szCs w:val="28"/>
+        </w:rPr>
+      </w:pPr>
+      <w:r>
+        <w:rPr>
+          <w:sz w:val="28"/>
+          <w:szCs w:val="28"/>
+        </w:rPr>
+        <w:t xml:space="preserve">См. </w:t>
+      </w:r>
+      <w:hyperlink w:anchor="_Пневматическое_оборудование" w:history="1">
+        <w:r>
+          <w:rPr>
+            <w:rStyle w:val="ad"/>
+            <w:sz w:val="28"/>
+            <w:szCs w:val="28"/>
+          </w:rPr>
+          <w:t>пневматическое оборудо</w:t>
+        </w:r>
+        <w:r>
+          <w:rPr>
+            <w:rStyle w:val="ad"/>
+            <w:sz w:val="28"/>
+            <w:szCs w:val="28"/>
+          </w:rPr>
+          <w:t>в</w:t>
+        </w:r>
+        <w:r>
+          <w:rPr>
+            <w:rStyle w:val="ad"/>
+            <w:sz w:val="28"/>
+            <w:szCs w:val="28"/>
+          </w:rPr>
+          <w:t>ание</w:t>
+        </w:r>
+      </w:hyperlink>
+      <w:r>
+        <w:rPr>
+          <w:sz w:val="28"/>
+          <w:szCs w:val="28"/>
+        </w:rPr>
+        <w:t xml:space="preserve"> (пункт </w:t>
+      </w:r>
+      <w:r>
+        <w:rPr>
+          <w:sz w:val="28"/>
+          <w:szCs w:val="28"/>
+          <w:lang w:val="en-US"/>
+        </w:rPr>
+        <w:t>V</w:t>
+      </w:r>
+      <w:r>
+        <w:rPr>
+          <w:sz w:val="28"/>
+          <w:szCs w:val="28"/>
+        </w:rPr>
+        <w:t xml:space="preserve">) для того, чтобы узнать о назначении клапанов и </w:t>
+      </w:r>
+      <w:hyperlink w:anchor="_Условные_обозначения" w:history="1">
+        <w:r>
+          <w:rPr>
+            <w:rStyle w:val="ad"/>
+            <w:sz w:val="28"/>
+            <w:szCs w:val="28"/>
+          </w:rPr>
+          <w:t>словарь</w:t>
+        </w:r>
+      </w:hyperlink>
+      <w:r>
+        <w:rPr>
+          <w:sz w:val="28"/>
+          <w:szCs w:val="28"/>
+        </w:rPr>
+        <w:t xml:space="preserve"> для расшифровки аббревиатур.</w:t>
+      </w:r>
     </w:p>
     <w:p>
       <w:pPr>
         <w:pStyle w:val="2"/>
       </w:pPr>
-      <w:bookmarkStart w:id="23" w:name="_Toc237014898"/>
+      <w:bookmarkStart w:id="25" w:name="_Toc237014898"/>
       <w:r>
         <w:rPr>
           <w:lang w:val="en-US"/>
@@ -7456,7 +7880,7 @@
         </w:rPr>
         <w:t>Loco</w:t>
       </w:r>
-      <w:bookmarkEnd w:id="23"/>
+      <w:bookmarkEnd w:id="25"/>
     </w:p>
     <w:p>
       <w:pPr>
@@ -7475,6 +7899,169 @@
         <w:t xml:space="preserve"> </w:t>
       </w:r>
       <w:r>
+        <w:t>6</w:t>
+      </w:r>
+      <w:r>
+        <w:t xml:space="preserve"> на </w:t>
+      </w:r>
+      <w:r>
+        <w:t>3</w:t>
+      </w:r>
+      <w:r>
+        <w:t>, который имеет следующую структуру:</w:t>
+      </w:r>
+    </w:p>
+    <w:p>
+      <w:pPr>
+        <w:jc w:val="center"/>
+      </w:pPr>
+      <w:r>
+        <w:rPr>
+          <w:noProof/>
+        </w:rPr>
+        <w:drawing>
+          <wp:inline distT="0" distB="0" distL="0" distR="0" wp14:anchorId="3F6CF973" wp14:editId="52CD21C4">
+            <wp:extent cx="4478400" cy="4651200"/>
+            <wp:effectExtent l="0" t="0" r="0" b="0"/>
+            <wp:docPr id="1" name="Рисунок 1"/>
+            <wp:cNvGraphicFramePr>
+              <a:graphicFrameLocks xmlns:a="http://schemas.openxmlformats.org/drawingml/2006/main" noChangeAspect="1"/>
+            </wp:cNvGraphicFramePr>
+            <a:graphic xmlns:a="http://schemas.openxmlformats.org/drawingml/2006/main">
+              <a:graphicData uri="http://schemas.openxmlformats.org/drawingml/2006/picture">
+                <pic:pic xmlns:pic="http://schemas.openxmlformats.org/drawingml/2006/picture">
+                  <pic:nvPicPr>
+                    <pic:cNvPr id="1" name=""/>
+                    <pic:cNvPicPr/>
+                  </pic:nvPicPr>
+                  <pic:blipFill>
+                    <a:blip r:embed="rId8">
+                      <a:extLst>
+                        <a:ext uri="{96DAC541-7B7A-43D3-8B79-37D633B846F1}">
+                          <asvg:svgBlip xmlns:asvg="http://schemas.microsoft.com/office/drawing/2016/SVG/main" r:embed="rId9"/>
+                        </a:ext>
+                      </a:extLst>
+                    </a:blip>
+                    <a:stretch>
+                      <a:fillRect/>
+                    </a:stretch>
+                  </pic:blipFill>
+                  <pic:spPr>
+                    <a:xfrm>
+                      <a:off x="0" y="0"/>
+                      <a:ext cx="4478400" cy="4651200"/>
+                    </a:xfrm>
+                    <a:prstGeom prst="rect">
+                      <a:avLst/>
+                    </a:prstGeom>
+                  </pic:spPr>
+                </pic:pic>
+              </a:graphicData>
+            </a:graphic>
+          </wp:inline>
+        </w:drawing>
+      </w:r>
+    </w:p>
+    <w:p>
+      <w:pPr>
+        <w:rPr>
+          <w:lang w:val="en-US"/>
+        </w:rPr>
+      </w:pPr>
+      <w:r>
+        <w:t>*ОПИСАТЬ*</w:t>
+      </w:r>
+    </w:p>
+    <w:p>
+      <w:pPr>
+        <w:rPr>
+          <w:rFonts w:asciiTheme="majorHAnsi" w:eastAsiaTheme="majorEastAsia" w:hAnsiTheme="majorHAnsi" w:cstheme="majorBidi"/>
+          <w:color w:val="0F4761" w:themeColor="accent1" w:themeShade="BF"/>
+          <w:sz w:val="32"/>
+          <w:szCs w:val="32"/>
+          <w:lang w:val="en-US"/>
+        </w:rPr>
+      </w:pPr>
+      <w:bookmarkStart w:id="26" w:name="_Toc237014899"/>
+      <w:r>
+        <w:rPr>
+          <w:lang w:val="en-US"/>
+        </w:rPr>
+        <w:br w:type="page"/>
+      </w:r>
+    </w:p>
+    <w:p>
+      <w:pPr>
+        <w:pStyle w:val="2"/>
+        <w:rPr>
+          <w:lang w:val="en-US"/>
+        </w:rPr>
+      </w:pPr>
+      <w:r>
+        <w:rPr>
+          <w:lang w:val="en-US"/>
+        </w:rPr>
+        <w:lastRenderedPageBreak/>
+        <w:t>Pneumatic</w:t>
+      </w:r>
+      <w:r>
+        <w:rPr>
+          <w:lang w:val="en-US"/>
+        </w:rPr>
+        <w:t xml:space="preserve"> </w:t>
+      </w:r>
+      <w:r>
+        <w:rPr>
+          <w:lang w:val="en-US"/>
+        </w:rPr>
+        <w:t>Brake</w:t>
+      </w:r>
+      <w:r>
+        <w:rPr>
+          <w:lang w:val="en-US"/>
+        </w:rPr>
+        <w:t xml:space="preserve"> </w:t>
+      </w:r>
+      <w:r>
+        <w:rPr>
+          <w:lang w:val="en-US"/>
+        </w:rPr>
+        <w:t>V</w:t>
+      </w:r>
+      <w:r>
+        <w:rPr>
+          <w:lang w:val="en-US"/>
+        </w:rPr>
+        <w:t>5</w:t>
+      </w:r>
+      <w:r>
+        <w:rPr>
+          <w:lang w:val="en-US"/>
+        </w:rPr>
+        <w:t xml:space="preserve"> Loco _w EPB</w:t>
+      </w:r>
+      <w:bookmarkEnd w:id="26"/>
+    </w:p>
+    <w:p>
+      <w:pPr>
+        <w:jc w:val="both"/>
+        <w:rPr>
+          <w:lang w:val="en-US"/>
+        </w:rPr>
+      </w:pPr>
+      <w:r>
+        <w:t>Микроконтроллер</w:t>
+      </w:r>
+      <w:r>
+        <w:t xml:space="preserve"> </w:t>
+      </w:r>
+      <w:r>
+        <w:t>размером</w:t>
+      </w:r>
+      <w:r>
+        <w:t xml:space="preserve"> </w:t>
+      </w:r>
+      <w:r>
         <w:rPr>
           <w:lang w:val="en-US"/>
         </w:rPr>
@@ -7495,6 +8082,560 @@
     </w:p>
     <w:p>
       <w:pPr>
+        <w:jc w:val="center"/>
+        <w:rPr>
+          <w:lang w:val="en-US"/>
+        </w:rPr>
+      </w:pPr>
+      <w:r>
+        <w:rPr>
+          <w:noProof/>
+          <w:lang w:val="en-US"/>
+        </w:rPr>
+        <w:drawing>
+          <wp:inline distT="0" distB="0" distL="0" distR="0" wp14:anchorId="2C711BF3" wp14:editId="627DCDF5">
+            <wp:extent cx="4489200" cy="4662000"/>
+            <wp:effectExtent l="0" t="0" r="6985" b="5715"/>
+            <wp:docPr id="3" name="Рисунок 3"/>
+            <wp:cNvGraphicFramePr>
+              <a:graphicFrameLocks xmlns:a="http://schemas.openxmlformats.org/drawingml/2006/main" noChangeAspect="1"/>
+            </wp:cNvGraphicFramePr>
+            <a:graphic xmlns:a="http://schemas.openxmlformats.org/drawingml/2006/main">
+              <a:graphicData uri="http://schemas.openxmlformats.org/drawingml/2006/picture">
+                <pic:pic xmlns:pic="http://schemas.openxmlformats.org/drawingml/2006/picture">
+                  <pic:nvPicPr>
+                    <pic:cNvPr id="3" name="Рисунок 3"/>
+                    <pic:cNvPicPr/>
+                  </pic:nvPicPr>
+                  <pic:blipFill>
+                    <a:blip r:embed="rId10">
+                      <a:extLst>
+                        <a:ext uri="{96DAC541-7B7A-43D3-8B79-37D633B846F1}">
+                          <asvg:svgBlip xmlns:asvg="http://schemas.microsoft.com/office/drawing/2016/SVG/main" r:embed="rId11"/>
+                        </a:ext>
+                      </a:extLst>
+                    </a:blip>
+                    <a:stretch>
+                      <a:fillRect/>
+                    </a:stretch>
+                  </pic:blipFill>
+                  <pic:spPr>
+                    <a:xfrm>
+                      <a:off x="0" y="0"/>
+                      <a:ext cx="4489200" cy="4662000"/>
+                    </a:xfrm>
+                    <a:prstGeom prst="rect">
+                      <a:avLst/>
+                    </a:prstGeom>
+                  </pic:spPr>
+                </pic:pic>
+              </a:graphicData>
+            </a:graphic>
+          </wp:inline>
+        </w:drawing>
+      </w:r>
+    </w:p>
+    <w:p>
+      <w:pPr>
+        <w:rPr>
+          <w:lang w:val="en-US"/>
+        </w:rPr>
+      </w:pPr>
+      <w:r>
+        <w:rPr>
+          <w:lang w:val="en-US"/>
+        </w:rPr>
+        <w:t>*</w:t>
+      </w:r>
+      <w:r>
+        <w:t>ОПИСАТЬ*</w:t>
+      </w:r>
+    </w:p>
+    <w:p>
+      <w:pPr>
+        <w:rPr>
+          <w:rFonts w:asciiTheme="majorHAnsi" w:eastAsiaTheme="majorEastAsia" w:hAnsiTheme="majorHAnsi" w:cstheme="majorBidi"/>
+          <w:color w:val="0F4761" w:themeColor="accent1" w:themeShade="BF"/>
+          <w:sz w:val="32"/>
+          <w:szCs w:val="32"/>
+          <w:lang w:val="en-US"/>
+        </w:rPr>
+      </w:pPr>
+      <w:bookmarkStart w:id="27" w:name="_Toc237014900"/>
+      <w:r>
+        <w:rPr>
+          <w:lang w:val="en-US"/>
+        </w:rPr>
+        <w:br w:type="page"/>
+      </w:r>
+    </w:p>
+    <w:p>
+      <w:pPr>
+        <w:pStyle w:val="2"/>
+        <w:rPr>
+          <w:lang w:val="en-US"/>
+        </w:rPr>
+      </w:pPr>
+      <w:r>
+        <w:rPr>
+          <w:lang w:val="en-US"/>
+        </w:rPr>
+        <w:lastRenderedPageBreak/>
+        <w:t>Pneumatic</w:t>
+      </w:r>
+      <w:r>
+        <w:rPr>
+          <w:lang w:val="en-US"/>
+        </w:rPr>
+        <w:t xml:space="preserve"> </w:t>
+      </w:r>
+      <w:r>
+        <w:rPr>
+          <w:lang w:val="en-US"/>
+        </w:rPr>
+        <w:t>Brake</w:t>
+      </w:r>
+      <w:r>
+        <w:rPr>
+          <w:lang w:val="en-US"/>
+        </w:rPr>
+        <w:t xml:space="preserve"> </w:t>
+      </w:r>
+      <w:r>
+        <w:rPr>
+          <w:lang w:val="en-US"/>
+        </w:rPr>
+        <w:t>V</w:t>
+      </w:r>
+      <w:r>
+        <w:rPr>
+          <w:lang w:val="en-US"/>
+        </w:rPr>
+        <w:t xml:space="preserve">5 </w:t>
+      </w:r>
+      <w:r>
+        <w:rPr>
+          <w:lang w:val="en-US"/>
+        </w:rPr>
+        <w:t>Wagon</w:t>
+      </w:r>
+      <w:bookmarkEnd w:id="27"/>
+    </w:p>
+    <w:p>
+      <w:pPr>
+        <w:jc w:val="both"/>
+      </w:pPr>
+      <w:r>
+        <w:t>Микроконтроллер</w:t>
+      </w:r>
+      <w:r>
+        <w:t xml:space="preserve"> </w:t>
+      </w:r>
+      <w:r>
+        <w:t>размером</w:t>
+      </w:r>
+      <w:r>
+        <w:t xml:space="preserve"> </w:t>
+      </w:r>
+      <w:r>
+        <w:rPr>
+          <w:lang w:val="en-US"/>
+        </w:rPr>
+        <w:t>X</w:t>
+      </w:r>
+      <w:r>
+        <w:t xml:space="preserve"> на </w:t>
+      </w:r>
+      <w:r>
+        <w:rPr>
+          <w:lang w:val="en-US"/>
+        </w:rPr>
+        <w:t>Y</w:t>
+      </w:r>
+      <w:r>
+        <w:t>, который имеет следующую структуру:</w:t>
+      </w:r>
+    </w:p>
+    <w:p>
+      <w:pPr>
+        <w:jc w:val="center"/>
+        <w:rPr>
+          <w:lang w:val="en-US"/>
+        </w:rPr>
+      </w:pPr>
+      <w:r>
+        <w:rPr>
+          <w:noProof/>
+          <w:lang w:val="en-US"/>
+        </w:rPr>
+        <w:drawing>
+          <wp:inline distT="0" distB="0" distL="0" distR="0" wp14:anchorId="1054E992" wp14:editId="606DBBD3">
+            <wp:extent cx="3117600" cy="3290400"/>
+            <wp:effectExtent l="0" t="0" r="6985" b="5715"/>
+            <wp:docPr id="6" name="Рисунок 6"/>
+            <wp:cNvGraphicFramePr>
+              <a:graphicFrameLocks xmlns:a="http://schemas.openxmlformats.org/drawingml/2006/main" noChangeAspect="1"/>
+            </wp:cNvGraphicFramePr>
+            <a:graphic xmlns:a="http://schemas.openxmlformats.org/drawingml/2006/main">
+              <a:graphicData uri="http://schemas.openxmlformats.org/drawingml/2006/picture">
+                <pic:pic xmlns:pic="http://schemas.openxmlformats.org/drawingml/2006/picture">
+                  <pic:nvPicPr>
+                    <pic:cNvPr id="6" name="Рисунок 6"/>
+                    <pic:cNvPicPr/>
+                  </pic:nvPicPr>
+                  <pic:blipFill>
+                    <a:blip r:embed="rId12">
+                      <a:extLst>
+                        <a:ext uri="{96DAC541-7B7A-43D3-8B79-37D633B846F1}">
+                          <asvg:svgBlip xmlns:asvg="http://schemas.microsoft.com/office/drawing/2016/SVG/main" r:embed="rId13"/>
+                        </a:ext>
+                      </a:extLst>
+                    </a:blip>
+                    <a:stretch>
+                      <a:fillRect/>
+                    </a:stretch>
+                  </pic:blipFill>
+                  <pic:spPr>
+                    <a:xfrm>
+                      <a:off x="0" y="0"/>
+                      <a:ext cx="3117600" cy="3290400"/>
+                    </a:xfrm>
+                    <a:prstGeom prst="rect">
+                      <a:avLst/>
+                    </a:prstGeom>
+                  </pic:spPr>
+                </pic:pic>
+              </a:graphicData>
+            </a:graphic>
+          </wp:inline>
+        </w:drawing>
+      </w:r>
+    </w:p>
+    <w:p>
+      <w:pPr>
+        <w:jc w:val="both"/>
+        <w:rPr>
+          <w:lang w:val="en-US"/>
+        </w:rPr>
+      </w:pPr>
+      <w:r>
+        <w:rPr>
+          <w:lang w:val="en-US"/>
+        </w:rPr>
+        <w:t>*</w:t>
+      </w:r>
+      <w:r>
+        <w:t>ОПИСАТЬ</w:t>
+      </w:r>
+      <w:r>
+        <w:rPr>
+          <w:lang w:val="en-US"/>
+        </w:rPr>
+        <w:t>*</w:t>
+      </w:r>
+    </w:p>
+    <w:p>
+      <w:pPr>
+        <w:rPr>
+          <w:rFonts w:asciiTheme="majorHAnsi" w:eastAsiaTheme="majorEastAsia" w:hAnsiTheme="majorHAnsi" w:cstheme="majorBidi"/>
+          <w:color w:val="0F4761" w:themeColor="accent1" w:themeShade="BF"/>
+          <w:sz w:val="32"/>
+          <w:szCs w:val="32"/>
+          <w:lang w:val="en-US"/>
+        </w:rPr>
+      </w:pPr>
+      <w:bookmarkStart w:id="28" w:name="_Toc237014901"/>
+      <w:r>
+        <w:rPr>
+          <w:lang w:val="en-US"/>
+        </w:rPr>
+        <w:br w:type="page"/>
+      </w:r>
+    </w:p>
+    <w:p>
+      <w:pPr>
+        <w:pStyle w:val="2"/>
+        <w:rPr>
+          <w:lang w:val="en-US"/>
+        </w:rPr>
+      </w:pPr>
+      <w:r>
+        <w:rPr>
+          <w:lang w:val="en-US"/>
+        </w:rPr>
+        <w:lastRenderedPageBreak/>
+        <w:t>Pneumatic</w:t>
+      </w:r>
+      <w:r>
+        <w:rPr>
+          <w:lang w:val="en-US"/>
+        </w:rPr>
+        <w:t xml:space="preserve"> </w:t>
+      </w:r>
+      <w:r>
+        <w:rPr>
+          <w:lang w:val="en-US"/>
+        </w:rPr>
+        <w:t>Brake</w:t>
+      </w:r>
+      <w:r>
+        <w:rPr>
+          <w:lang w:val="en-US"/>
+        </w:rPr>
+        <w:t xml:space="preserve"> </w:t>
+      </w:r>
+      <w:r>
+        <w:rPr>
+          <w:lang w:val="en-US"/>
+        </w:rPr>
+        <w:t>V</w:t>
+      </w:r>
+      <w:r>
+        <w:rPr>
+          <w:lang w:val="en-US"/>
+        </w:rPr>
+        <w:t>5</w:t>
+      </w:r>
+      <w:r>
+        <w:rPr>
+          <w:lang w:val="en-US"/>
+        </w:rPr>
+        <w:t xml:space="preserve"> Wagon</w:t>
+      </w:r>
+      <w:r>
+        <w:rPr>
+          <w:lang w:val="en-US"/>
+        </w:rPr>
+        <w:t xml:space="preserve"> </w:t>
+      </w:r>
+      <w:r>
+        <w:rPr>
+          <w:lang w:val="en-US"/>
+        </w:rPr>
+        <w:t>_w EPB</w:t>
+      </w:r>
+      <w:bookmarkEnd w:id="28"/>
+    </w:p>
+    <w:p>
+      <w:pPr>
+        <w:jc w:val="both"/>
+      </w:pPr>
+      <w:r>
+        <w:t>Микроконтроллер</w:t>
+      </w:r>
+      <w:r>
+        <w:t xml:space="preserve"> </w:t>
+      </w:r>
+      <w:r>
+        <w:t>размером</w:t>
+      </w:r>
+      <w:r>
+        <w:t xml:space="preserve"> </w:t>
+      </w:r>
+      <w:r>
+        <w:rPr>
+          <w:lang w:val="en-US"/>
+        </w:rPr>
+        <w:t>X</w:t>
+      </w:r>
+      <w:r>
+        <w:t xml:space="preserve"> на </w:t>
+      </w:r>
+      <w:r>
+        <w:rPr>
+          <w:lang w:val="en-US"/>
+        </w:rPr>
+        <w:t>Y</w:t>
+      </w:r>
+      <w:r>
+        <w:t>, который имеет следующую структуру:</w:t>
+      </w:r>
+    </w:p>
+    <w:p>
+      <w:pPr>
+        <w:jc w:val="center"/>
+        <w:rPr>
+          <w:lang w:val="en-US"/>
+        </w:rPr>
+      </w:pPr>
+      <w:r>
+        <w:rPr>
+          <w:noProof/>
+          <w:lang w:val="en-US"/>
+        </w:rPr>
+        <w:drawing>
+          <wp:inline distT="0" distB="0" distL="0" distR="0" wp14:anchorId="0E1CAB0B" wp14:editId="6CCB7F2B">
+            <wp:extent cx="3117600" cy="3290400"/>
+            <wp:effectExtent l="0" t="0" r="6985" b="5715"/>
+            <wp:docPr id="5" name="Рисунок 5"/>
+            <wp:cNvGraphicFramePr>
+              <a:graphicFrameLocks xmlns:a="http://schemas.openxmlformats.org/drawingml/2006/main" noChangeAspect="1"/>
+            </wp:cNvGraphicFramePr>
+            <a:graphic xmlns:a="http://schemas.openxmlformats.org/drawingml/2006/main">
+              <a:graphicData uri="http://schemas.openxmlformats.org/drawingml/2006/picture">
+                <pic:pic xmlns:pic="http://schemas.openxmlformats.org/drawingml/2006/picture">
+                  <pic:nvPicPr>
+                    <pic:cNvPr id="5" name="Рисунок 5"/>
+                    <pic:cNvPicPr/>
+                  </pic:nvPicPr>
+                  <pic:blipFill>
+                    <a:blip r:embed="rId14">
+                      <a:extLst>
+                        <a:ext uri="{96DAC541-7B7A-43D3-8B79-37D633B846F1}">
+                          <asvg:svgBlip xmlns:asvg="http://schemas.microsoft.com/office/drawing/2016/SVG/main" r:embed="rId15"/>
+                        </a:ext>
+                      </a:extLst>
+                    </a:blip>
+                    <a:stretch>
+                      <a:fillRect/>
+                    </a:stretch>
+                  </pic:blipFill>
+                  <pic:spPr>
+                    <a:xfrm>
+                      <a:off x="0" y="0"/>
+                      <a:ext cx="3117600" cy="3290400"/>
+                    </a:xfrm>
+                    <a:prstGeom prst="rect">
+                      <a:avLst/>
+                    </a:prstGeom>
+                  </pic:spPr>
+                </pic:pic>
+              </a:graphicData>
+            </a:graphic>
+          </wp:inline>
+        </w:drawing>
+      </w:r>
+    </w:p>
+    <w:p>
+      <w:pPr>
+        <w:jc w:val="both"/>
+        <w:rPr>
+          <w:lang w:val="en-US"/>
+        </w:rPr>
+      </w:pPr>
+      <w:r>
+        <w:rPr>
+          <w:lang w:val="en-US"/>
+        </w:rPr>
+        <w:t>*</w:t>
+      </w:r>
+      <w:r>
+        <w:t>ОПИСАТЬ</w:t>
+      </w:r>
+      <w:r>
+        <w:rPr>
+          <w:lang w:val="en-US"/>
+        </w:rPr>
+        <w:t>*</w:t>
+      </w:r>
+    </w:p>
+    <w:p>
+      <w:pPr>
+        <w:rPr>
+          <w:rFonts w:asciiTheme="majorHAnsi" w:eastAsiaTheme="majorEastAsia" w:hAnsiTheme="majorHAnsi" w:cstheme="majorBidi"/>
+          <w:color w:val="0F4761" w:themeColor="accent1" w:themeShade="BF"/>
+          <w:sz w:val="32"/>
+          <w:szCs w:val="32"/>
+          <w:lang w:val="en-US"/>
+        </w:rPr>
+      </w:pPr>
+      <w:bookmarkStart w:id="29" w:name="_Toc237014902"/>
+      <w:r>
+        <w:rPr>
+          <w:lang w:val="en-US"/>
+        </w:rPr>
+        <w:br w:type="page"/>
+      </w:r>
+    </w:p>
+    <w:p>
+      <w:pPr>
+        <w:pStyle w:val="2"/>
+        <w:rPr>
+          <w:lang w:val="en-US"/>
+        </w:rPr>
+      </w:pPr>
+      <w:r>
+        <w:rPr>
+          <w:lang w:val="en-US"/>
+        </w:rPr>
+        <w:lastRenderedPageBreak/>
+        <w:t>Pneumatic</w:t>
+      </w:r>
+      <w:r>
+        <w:rPr>
+          <w:lang w:val="en-US"/>
+        </w:rPr>
+        <w:t xml:space="preserve"> </w:t>
+      </w:r>
+      <w:r>
+        <w:rPr>
+          <w:lang w:val="en-US"/>
+        </w:rPr>
+        <w:t>Brake</w:t>
+      </w:r>
+      <w:r>
+        <w:rPr>
+          <w:lang w:val="en-US"/>
+        </w:rPr>
+        <w:t xml:space="preserve"> </w:t>
+      </w:r>
+      <w:r>
+        <w:rPr>
+          <w:lang w:val="en-US"/>
+        </w:rPr>
+        <w:t>V</w:t>
+      </w:r>
+      <w:r>
+        <w:rPr>
+          <w:lang w:val="en-US"/>
+        </w:rPr>
+        <w:t>5</w:t>
+      </w:r>
+      <w:r>
+        <w:rPr>
+          <w:lang w:val="en-US"/>
+        </w:rPr>
+        <w:t xml:space="preserve"> Wagon _w FABS</w:t>
+      </w:r>
+      <w:bookmarkEnd w:id="29"/>
+    </w:p>
+    <w:p>
+      <w:pPr>
+        <w:jc w:val="both"/>
+      </w:pPr>
+      <w:r>
+        <w:t>Микроконтроллер</w:t>
+      </w:r>
+      <w:r>
+        <w:t xml:space="preserve"> </w:t>
+      </w:r>
+      <w:r>
+        <w:t>размером</w:t>
+      </w:r>
+      <w:r>
+        <w:t xml:space="preserve"> </w:t>
+      </w:r>
+      <w:r>
+        <w:rPr>
+          <w:lang w:val="en-US"/>
+        </w:rPr>
+        <w:t>X</w:t>
+      </w:r>
+      <w:r>
+        <w:t xml:space="preserve"> на </w:t>
+      </w:r>
+      <w:r>
+        <w:rPr>
+          <w:lang w:val="en-US"/>
+        </w:rPr>
+        <w:t>Y</w:t>
+      </w:r>
+      <w:r>
+        <w:t>, который имеет следующую структуру:</w:t>
+      </w:r>
+    </w:p>
+    <w:p>
+      <w:pPr>
         <w:jc w:val="both"/>
       </w:pPr>
       <w:r>
@@ -7519,34 +8660,43 @@
     </w:p>
     <w:p>
       <w:pPr>
+        <w:rPr>
+          <w:rFonts w:asciiTheme="majorHAnsi" w:eastAsiaTheme="majorEastAsia" w:hAnsiTheme="majorHAnsi" w:cstheme="majorBidi"/>
+          <w:color w:val="0F4761" w:themeColor="accent1" w:themeShade="BF"/>
+          <w:sz w:val="32"/>
+          <w:szCs w:val="32"/>
+          <w:lang w:val="en-US"/>
+        </w:rPr>
+      </w:pPr>
+      <w:bookmarkStart w:id="30" w:name="_Toc237014903"/>
+      <w:r>
+        <w:rPr>
+          <w:lang w:val="en-US"/>
+        </w:rPr>
+        <w:br w:type="page"/>
+      </w:r>
+    </w:p>
+    <w:p>
+      <w:pPr>
         <w:pStyle w:val="2"/>
-        <w:rPr>
-          <w:lang w:val="en-US"/>
-        </w:rPr>
-      </w:pPr>
-      <w:bookmarkStart w:id="24" w:name="_Toc237014899"/>
-      <w:r>
-        <w:rPr>
-          <w:lang w:val="en-US"/>
-        </w:rPr>
-        <w:t>Pneumatic</w:t>
-      </w:r>
-      <w:r>
-        <w:rPr>
-          <w:lang w:val="en-US"/>
-        </w:rPr>
+      </w:pPr>
+      <w:r>
+        <w:rPr>
+          <w:lang w:val="en-US"/>
+        </w:rPr>
+        <w:lastRenderedPageBreak/>
+        <w:t>Vigilance</w:t>
+      </w:r>
+      <w:r>
         <w:t xml:space="preserve"> </w:t>
       </w:r>
       <w:r>
         <w:rPr>
           <w:lang w:val="en-US"/>
         </w:rPr>
-        <w:t>Brake</w:t>
-      </w:r>
-      <w:r>
-        <w:rPr>
-          <w:lang w:val="en-US"/>
-        </w:rPr>
+        <w:t>Devices</w:t>
+      </w:r>
+      <w:r>
         <w:t xml:space="preserve"> </w:t>
       </w:r>
       <w:r>
@@ -7556,18 +8706,9 @@
         <w:t>V</w:t>
       </w:r>
       <w:r>
-        <w:rPr>
-          <w:lang w:val="en-US"/>
-        </w:rPr>
-        <w:t>5</w:t>
-      </w:r>
-      <w:r>
-        <w:rPr>
-          <w:lang w:val="en-US"/>
-        </w:rPr>
-        <w:t xml:space="preserve"> Loco _w EPB</w:t>
-      </w:r>
-      <w:bookmarkEnd w:id="24"/>
+        <w:t>2</w:t>
+      </w:r>
+      <w:bookmarkEnd w:id="30"/>
     </w:p>
     <w:p>
       <w:pPr>
@@ -7630,14 +8771,32 @@
     </w:p>
     <w:p>
       <w:pPr>
+        <w:rPr>
+          <w:rFonts w:asciiTheme="majorHAnsi" w:eastAsiaTheme="majorEastAsia" w:hAnsiTheme="majorHAnsi" w:cstheme="majorBidi"/>
+          <w:color w:val="0F4761" w:themeColor="accent1" w:themeShade="BF"/>
+          <w:sz w:val="32"/>
+          <w:szCs w:val="32"/>
+          <w:lang w:val="en-US"/>
+        </w:rPr>
+      </w:pPr>
+      <w:bookmarkStart w:id="31" w:name="_Toc237014904"/>
+      <w:r>
+        <w:rPr>
+          <w:lang w:val="en-US"/>
+        </w:rPr>
+        <w:br w:type="page"/>
+      </w:r>
+    </w:p>
+    <w:p>
+      <w:pPr>
         <w:pStyle w:val="2"/>
       </w:pPr>
-      <w:bookmarkStart w:id="25" w:name="_Toc237014900"/>
-      <w:r>
-        <w:rPr>
-          <w:lang w:val="en-US"/>
-        </w:rPr>
-        <w:t>Pneumatic</w:t>
+      <w:r>
+        <w:rPr>
+          <w:lang w:val="en-US"/>
+        </w:rPr>
+        <w:lastRenderedPageBreak/>
+        <w:t>Electric</w:t>
       </w:r>
       <w:r>
         <w:t xml:space="preserve"> </w:t>
@@ -7646,7 +8805,7 @@
         <w:rPr>
           <w:lang w:val="en-US"/>
         </w:rPr>
-        <w:t>Brake</w:t>
+        <w:t>Bill</w:t>
       </w:r>
       <w:r>
         <w:t xml:space="preserve"> </w:t>
@@ -7655,18 +8814,9 @@
         <w:rPr>
           <w:lang w:val="en-US"/>
         </w:rPr>
-        <w:t>V</w:t>
-      </w:r>
-      <w:r>
-        <w:t xml:space="preserve">5 </w:t>
-      </w:r>
-      <w:r>
-        <w:rPr>
-          <w:lang w:val="en-US"/>
-        </w:rPr>
-        <w:t>Wagon</w:t>
-      </w:r>
-      <w:bookmarkEnd w:id="25"/>
+        <w:t>Limiter</w:t>
+      </w:r>
+      <w:bookmarkEnd w:id="31"/>
     </w:p>
     <w:p>
       <w:pPr>
@@ -7729,443 +8879,43 @@
     </w:p>
     <w:p>
       <w:pPr>
+        <w:rPr>
+          <w:rFonts w:asciiTheme="majorHAnsi" w:eastAsiaTheme="majorEastAsia" w:hAnsiTheme="majorHAnsi" w:cstheme="majorBidi"/>
+          <w:color w:val="0F4761" w:themeColor="accent1" w:themeShade="BF"/>
+          <w:sz w:val="32"/>
+          <w:szCs w:val="32"/>
+          <w:lang w:val="en-US"/>
+        </w:rPr>
+      </w:pPr>
+      <w:bookmarkStart w:id="32" w:name="_Toc237014905"/>
+      <w:r>
+        <w:rPr>
+          <w:lang w:val="en-US"/>
+        </w:rPr>
+        <w:br w:type="page"/>
+      </w:r>
+    </w:p>
+    <w:p>
+      <w:pPr>
         <w:pStyle w:val="2"/>
-        <w:rPr>
-          <w:lang w:val="en-US"/>
-        </w:rPr>
-      </w:pPr>
-      <w:bookmarkStart w:id="26" w:name="_Toc237014901"/>
-      <w:r>
-        <w:rPr>
-          <w:lang w:val="en-US"/>
-        </w:rPr>
-        <w:t>Pneumatic</w:t>
-      </w:r>
-      <w:r>
-        <w:rPr>
-          <w:lang w:val="en-US"/>
-        </w:rPr>
+      </w:pPr>
+      <w:r>
+        <w:rPr>
+          <w:lang w:val="en-US"/>
+        </w:rPr>
+        <w:lastRenderedPageBreak/>
+        <w:t>TEM</w:t>
+      </w:r>
+      <w:r>
         <w:t xml:space="preserve"> </w:t>
       </w:r>
       <w:r>
         <w:rPr>
           <w:lang w:val="en-US"/>
         </w:rPr>
-        <w:t>Brake</w:t>
-      </w:r>
-      <w:r>
-        <w:rPr>
-          <w:lang w:val="en-US"/>
-        </w:rPr>
-        <w:t xml:space="preserve"> </w:t>
-      </w:r>
-      <w:r>
-        <w:rPr>
-          <w:lang w:val="en-US"/>
-        </w:rPr>
-        <w:t>V</w:t>
-      </w:r>
-      <w:r>
-        <w:rPr>
-          <w:lang w:val="en-US"/>
-        </w:rPr>
-        <w:t>5</w:t>
-      </w:r>
-      <w:r>
-        <w:rPr>
-          <w:lang w:val="en-US"/>
-        </w:rPr>
-        <w:t xml:space="preserve"> Wagon</w:t>
-      </w:r>
-      <w:r>
-        <w:rPr>
-          <w:lang w:val="en-US"/>
-        </w:rPr>
-        <w:t xml:space="preserve"> </w:t>
-      </w:r>
-      <w:r>
-        <w:rPr>
-          <w:lang w:val="en-US"/>
-        </w:rPr>
-        <w:t>_w EPB</w:t>
-      </w:r>
-      <w:bookmarkEnd w:id="26"/>
-    </w:p>
-    <w:p>
-      <w:pPr>
-        <w:jc w:val="both"/>
-      </w:pPr>
-      <w:r>
-        <w:t>Микроконтроллер</w:t>
-      </w:r>
-      <w:r>
-        <w:t xml:space="preserve"> </w:t>
-      </w:r>
-      <w:r>
-        <w:t>размером</w:t>
-      </w:r>
-      <w:r>
-        <w:t xml:space="preserve"> </w:t>
-      </w:r>
-      <w:r>
-        <w:rPr>
-          <w:lang w:val="en-US"/>
-        </w:rPr>
-        <w:t>X</w:t>
-      </w:r>
-      <w:r>
-        <w:t xml:space="preserve"> на </w:t>
-      </w:r>
-      <w:r>
-        <w:rPr>
-          <w:lang w:val="en-US"/>
-        </w:rPr>
-        <w:t>Y</w:t>
-      </w:r>
-      <w:r>
-        <w:t>, который имеет следующую структуру:</w:t>
-      </w:r>
-    </w:p>
-    <w:p>
-      <w:pPr>
-        <w:jc w:val="both"/>
-      </w:pPr>
-      <w:r>
-        <w:t>*Вставить фото структуры*</w:t>
-      </w:r>
-    </w:p>
-    <w:p>
-      <w:pPr>
-        <w:jc w:val="both"/>
-      </w:pPr>
-      <w:r>
-        <w:t>*Описать логические входы*</w:t>
-      </w:r>
-    </w:p>
-    <w:p>
-      <w:pPr>
-        <w:jc w:val="both"/>
-      </w:pPr>
-      <w:r>
-        <w:t>*Описать принцип взаимодействия микроконтроллера и игрока*</w:t>
-      </w:r>
-    </w:p>
-    <w:p>
-      <w:pPr>
-        <w:pStyle w:val="2"/>
-        <w:rPr>
-          <w:lang w:val="en-US"/>
-        </w:rPr>
-      </w:pPr>
-      <w:bookmarkStart w:id="27" w:name="_Toc237014902"/>
-      <w:r>
-        <w:rPr>
-          <w:lang w:val="en-US"/>
-        </w:rPr>
-        <w:t>Pneumatic</w:t>
-      </w:r>
-      <w:r>
-        <w:rPr>
-          <w:lang w:val="en-US"/>
-        </w:rPr>
-        <w:t xml:space="preserve"> </w:t>
-      </w:r>
-      <w:r>
-        <w:rPr>
-          <w:lang w:val="en-US"/>
-        </w:rPr>
-        <w:t>Brake</w:t>
-      </w:r>
-      <w:r>
-        <w:rPr>
-          <w:lang w:val="en-US"/>
-        </w:rPr>
-        <w:t xml:space="preserve"> </w:t>
-      </w:r>
-      <w:r>
-        <w:rPr>
-          <w:lang w:val="en-US"/>
-        </w:rPr>
-        <w:t>V</w:t>
-      </w:r>
-      <w:r>
-        <w:rPr>
-          <w:lang w:val="en-US"/>
-        </w:rPr>
-        <w:t>5</w:t>
-      </w:r>
-      <w:r>
-        <w:rPr>
-          <w:lang w:val="en-US"/>
-        </w:rPr>
-        <w:t xml:space="preserve"> Wagon _w FABS</w:t>
-      </w:r>
-      <w:bookmarkEnd w:id="27"/>
-    </w:p>
-    <w:p>
-      <w:pPr>
-        <w:jc w:val="both"/>
-      </w:pPr>
-      <w:r>
-        <w:t>Микроконтроллер</w:t>
-      </w:r>
-      <w:r>
-        <w:t xml:space="preserve"> </w:t>
-      </w:r>
-      <w:r>
-        <w:t>размером</w:t>
-      </w:r>
-      <w:r>
-        <w:t xml:space="preserve"> </w:t>
-      </w:r>
-      <w:r>
-        <w:rPr>
-          <w:lang w:val="en-US"/>
-        </w:rPr>
-        <w:t>X</w:t>
-      </w:r>
-      <w:r>
-        <w:t xml:space="preserve"> на </w:t>
-      </w:r>
-      <w:r>
-        <w:rPr>
-          <w:lang w:val="en-US"/>
-        </w:rPr>
-        <w:t>Y</w:t>
-      </w:r>
-      <w:r>
-        <w:t>, который имеет следующую структуру:</w:t>
-      </w:r>
-    </w:p>
-    <w:p>
-      <w:pPr>
-        <w:jc w:val="both"/>
-      </w:pPr>
-      <w:r>
-        <w:t>*Вставить фото структуры*</w:t>
-      </w:r>
-    </w:p>
-    <w:p>
-      <w:pPr>
-        <w:jc w:val="both"/>
-      </w:pPr>
-      <w:r>
-        <w:t>*Описать логические входы*</w:t>
-      </w:r>
-    </w:p>
-    <w:p>
-      <w:pPr>
-        <w:jc w:val="both"/>
-      </w:pPr>
-      <w:r>
-        <w:t>*Описать принцип взаимодействия микроконтроллера и игрока*</w:t>
-      </w:r>
-    </w:p>
-    <w:p>
-      <w:pPr>
-        <w:pStyle w:val="2"/>
-      </w:pPr>
-      <w:bookmarkStart w:id="28" w:name="_Toc237014903"/>
-      <w:r>
-        <w:rPr>
-          <w:lang w:val="en-US"/>
-        </w:rPr>
-        <w:t>Vigilance</w:t>
-      </w:r>
-      <w:r>
-        <w:t xml:space="preserve"> </w:t>
-      </w:r>
-      <w:r>
-        <w:rPr>
-          <w:lang w:val="en-US"/>
-        </w:rPr>
-        <w:t>Devices</w:t>
-      </w:r>
-      <w:r>
-        <w:t xml:space="preserve"> </w:t>
-      </w:r>
-      <w:r>
-        <w:rPr>
-          <w:lang w:val="en-US"/>
-        </w:rPr>
-        <w:t>V</w:t>
-      </w:r>
-      <w:r>
-        <w:t>2</w:t>
-      </w:r>
-      <w:bookmarkEnd w:id="28"/>
-    </w:p>
-    <w:p>
-      <w:pPr>
-        <w:jc w:val="both"/>
-      </w:pPr>
-      <w:r>
-        <w:t>Микроконтроллер</w:t>
-      </w:r>
-      <w:r>
-        <w:t xml:space="preserve"> </w:t>
-      </w:r>
-      <w:r>
-        <w:t>размером</w:t>
-      </w:r>
-      <w:r>
-        <w:t xml:space="preserve"> </w:t>
-      </w:r>
-      <w:r>
-        <w:rPr>
-          <w:lang w:val="en-US"/>
-        </w:rPr>
-        <w:t>X</w:t>
-      </w:r>
-      <w:r>
-        <w:t xml:space="preserve"> на </w:t>
-      </w:r>
-      <w:r>
-        <w:rPr>
-          <w:lang w:val="en-US"/>
-        </w:rPr>
-        <w:t>Y</w:t>
-      </w:r>
-      <w:r>
-        <w:t>, который имеет следующую структуру:</w:t>
-      </w:r>
-    </w:p>
-    <w:p>
-      <w:pPr>
-        <w:jc w:val="both"/>
-      </w:pPr>
-      <w:r>
-        <w:lastRenderedPageBreak/>
-        <w:t>*Вставить фото структуры*</w:t>
-      </w:r>
-    </w:p>
-    <w:p>
-      <w:pPr>
-        <w:jc w:val="both"/>
-      </w:pPr>
-      <w:r>
-        <w:t>*Описать логические входы*</w:t>
-      </w:r>
-    </w:p>
-    <w:p>
-      <w:pPr>
-        <w:jc w:val="both"/>
-      </w:pPr>
-      <w:r>
-        <w:t>*Описать принцип взаимодействия микроконтроллера и игрока*</w:t>
-      </w:r>
-    </w:p>
-    <w:p>
-      <w:pPr>
-        <w:pStyle w:val="2"/>
-      </w:pPr>
-      <w:bookmarkStart w:id="29" w:name="_Toc237014904"/>
-      <w:r>
-        <w:rPr>
-          <w:lang w:val="en-US"/>
-        </w:rPr>
-        <w:t>Electric</w:t>
-      </w:r>
-      <w:r>
-        <w:t xml:space="preserve"> </w:t>
-      </w:r>
-      <w:r>
-        <w:rPr>
-          <w:lang w:val="en-US"/>
-        </w:rPr>
-        <w:t>Bill</w:t>
-      </w:r>
-      <w:r>
-        <w:t xml:space="preserve"> </w:t>
-      </w:r>
-      <w:r>
-        <w:rPr>
-          <w:lang w:val="en-US"/>
-        </w:rPr>
-        <w:t>Limiter</w:t>
-      </w:r>
-      <w:bookmarkEnd w:id="29"/>
-    </w:p>
-    <w:p>
-      <w:pPr>
-        <w:jc w:val="both"/>
-      </w:pPr>
-      <w:r>
-        <w:t>Микроконтроллер</w:t>
-      </w:r>
-      <w:r>
-        <w:t xml:space="preserve"> </w:t>
-      </w:r>
-      <w:r>
-        <w:t>размером</w:t>
-      </w:r>
-      <w:r>
-        <w:t xml:space="preserve"> </w:t>
-      </w:r>
-      <w:r>
-        <w:rPr>
-          <w:lang w:val="en-US"/>
-        </w:rPr>
-        <w:t>X</w:t>
-      </w:r>
-      <w:r>
-        <w:t xml:space="preserve"> на </w:t>
-      </w:r>
-      <w:r>
-        <w:rPr>
-          <w:lang w:val="en-US"/>
-        </w:rPr>
-        <w:t>Y</w:t>
-      </w:r>
-      <w:r>
-        <w:t>, который имеет следующую структуру:</w:t>
-      </w:r>
-    </w:p>
-    <w:p>
-      <w:pPr>
-        <w:jc w:val="both"/>
-      </w:pPr>
-      <w:r>
-        <w:t>*Вставить фото структуры*</w:t>
-      </w:r>
-    </w:p>
-    <w:p>
-      <w:pPr>
-        <w:jc w:val="both"/>
-      </w:pPr>
-      <w:r>
-        <w:t>*Описать логические входы*</w:t>
-      </w:r>
-    </w:p>
-    <w:p>
-      <w:pPr>
-        <w:jc w:val="both"/>
-      </w:pPr>
-      <w:r>
-        <w:t>*Описать принцип взаимодействия микроконтроллера и игрока*</w:t>
-      </w:r>
-    </w:p>
-    <w:p>
-      <w:pPr>
-        <w:pStyle w:val="2"/>
-      </w:pPr>
-      <w:bookmarkStart w:id="30" w:name="_Toc237014905"/>
-      <w:r>
-        <w:rPr>
-          <w:lang w:val="en-US"/>
-        </w:rPr>
-        <w:t>TEM</w:t>
-      </w:r>
-      <w:r>
-        <w:t xml:space="preserve"> </w:t>
-      </w:r>
-      <w:r>
-        <w:rPr>
-          <w:lang w:val="en-US"/>
-        </w:rPr>
         <w:t>Controller</w:t>
       </w:r>
-      <w:bookmarkEnd w:id="30"/>
+      <w:bookmarkEnd w:id="32"/>
     </w:p>
     <w:p>
       <w:pPr>
@@ -8240,7 +8990,7 @@
           <w:spacing w:val="100"/>
         </w:rPr>
       </w:pPr>
-      <w:bookmarkStart w:id="31" w:name="_Toc237014906"/>
+      <w:bookmarkStart w:id="33" w:name="_Toc237014906"/>
       <w:r>
         <w:rPr>
           <w:caps/>
@@ -8249,13 +8999,13 @@
         <w:lastRenderedPageBreak/>
         <w:t>Пневматические схемы</w:t>
       </w:r>
-      <w:bookmarkEnd w:id="31"/>
+      <w:bookmarkEnd w:id="33"/>
     </w:p>
     <w:p>
       <w:pPr>
         <w:pStyle w:val="2"/>
       </w:pPr>
-      <w:bookmarkStart w:id="32" w:name="_Toc237014907"/>
+      <w:bookmarkStart w:id="34" w:name="_Toc237014907"/>
       <w:r>
         <w:t xml:space="preserve">Локомотивная пневматическая </w:t>
       </w:r>
@@ -8265,7 +9015,7 @@
       <w:r>
         <w:t>схема без ЭПТ</w:t>
       </w:r>
-      <w:bookmarkEnd w:id="32"/>
+      <w:bookmarkEnd w:id="34"/>
     </w:p>
     <w:p>
       <w:pPr>
@@ -8295,7 +9045,7 @@
       <w:pPr>
         <w:pStyle w:val="2"/>
       </w:pPr>
-      <w:bookmarkStart w:id="33" w:name="_Toc237014908"/>
+      <w:bookmarkStart w:id="35" w:name="_Toc237014908"/>
       <w:r>
         <w:t>Локомотивная пневматическая</w:t>
       </w:r>
@@ -8305,7 +9055,7 @@
       <w:r>
         <w:t>схема с ЭПТ</w:t>
       </w:r>
-      <w:bookmarkEnd w:id="33"/>
+      <w:bookmarkEnd w:id="35"/>
     </w:p>
     <w:p>
       <w:pPr>
@@ -8335,7 +9085,7 @@
       <w:pPr>
         <w:pStyle w:val="2"/>
       </w:pPr>
-      <w:bookmarkStart w:id="34" w:name="_Toc237014909"/>
+      <w:bookmarkStart w:id="36" w:name="_Toc237014909"/>
       <w:r>
         <w:t>Вагонная пневматическая</w:t>
       </w:r>
@@ -8345,7 +9095,7 @@
       <w:r>
         <w:t>схема без ЭПТ</w:t>
       </w:r>
-      <w:bookmarkEnd w:id="34"/>
+      <w:bookmarkEnd w:id="36"/>
     </w:p>
     <w:p>
       <w:pPr>
@@ -8375,7 +9125,7 @@
       <w:pPr>
         <w:pStyle w:val="2"/>
       </w:pPr>
-      <w:bookmarkStart w:id="35" w:name="_Toc237014910"/>
+      <w:bookmarkStart w:id="37" w:name="_Toc237014910"/>
       <w:r>
         <w:t>Вагонная пневматическая</w:t>
       </w:r>
@@ -8385,7 +9135,7 @@
       <w:r>
         <w:t>схема с ЭПТ</w:t>
       </w:r>
-      <w:bookmarkEnd w:id="35"/>
+      <w:bookmarkEnd w:id="37"/>
     </w:p>
     <w:p>
       <w:pPr>
@@ -8415,11 +9165,11 @@
       <w:pPr>
         <w:pStyle w:val="2"/>
       </w:pPr>
-      <w:bookmarkStart w:id="36" w:name="_Toc237014911"/>
+      <w:bookmarkStart w:id="38" w:name="_Toc237014911"/>
       <w:r>
         <w:t>Локомотивная высоковольтная схема</w:t>
       </w:r>
-      <w:bookmarkEnd w:id="36"/>
+      <w:bookmarkEnd w:id="38"/>
     </w:p>
     <w:p>
       <w:pPr>
@@ -8449,11 +9199,11 @@
       <w:pPr>
         <w:pStyle w:val="2"/>
       </w:pPr>
-      <w:bookmarkStart w:id="37" w:name="_Toc237014912"/>
+      <w:bookmarkStart w:id="39" w:name="_Toc237014912"/>
       <w:r>
         <w:t>Вагонная пневматическая схема опрокидывания кузова</w:t>
       </w:r>
-      <w:bookmarkEnd w:id="37"/>
+      <w:bookmarkEnd w:id="39"/>
     </w:p>
     <w:p>
       <w:pPr>
@@ -8483,11 +9233,11 @@
       <w:pPr>
         <w:pStyle w:val="2"/>
       </w:pPr>
-      <w:bookmarkStart w:id="38" w:name="_Toc237014913"/>
+      <w:bookmarkStart w:id="40" w:name="_Toc237014913"/>
       <w:r>
         <w:t>Моторвагонная пневматическая тормозная схема</w:t>
       </w:r>
-      <w:bookmarkEnd w:id="38"/>
+      <w:bookmarkEnd w:id="40"/>
     </w:p>
     <w:p>
       <w:r>
@@ -8509,11 +9259,11 @@
       <w:pPr>
         <w:pStyle w:val="2"/>
       </w:pPr>
-      <w:bookmarkStart w:id="39" w:name="_Toc237014914"/>
+      <w:bookmarkStart w:id="41" w:name="_Toc237014914"/>
       <w:r>
         <w:t>Моторвагонная пневматическая схема дверей</w:t>
       </w:r>
-      <w:bookmarkEnd w:id="39"/>
+      <w:bookmarkEnd w:id="41"/>
     </w:p>
     <w:p>
       <w:pPr>
@@ -8547,7 +9297,7 @@
       <w:r>
         <w:br w:type="column"/>
       </w:r>
-      <w:bookmarkStart w:id="40" w:name="_Toc237014915"/>
+      <w:bookmarkStart w:id="42" w:name="_Toc237014915"/>
       <w:r>
         <w:rPr>
           <w:caps/>
@@ -8556,17 +9306,17 @@
         <w:lastRenderedPageBreak/>
         <w:t>Автосцепки</w:t>
       </w:r>
-      <w:bookmarkEnd w:id="40"/>
+      <w:bookmarkEnd w:id="42"/>
     </w:p>
     <w:p>
       <w:pPr>
         <w:pStyle w:val="2"/>
       </w:pPr>
-      <w:bookmarkStart w:id="41" w:name="_Toc237014916"/>
+      <w:bookmarkStart w:id="43" w:name="_Toc237014916"/>
       <w:r>
         <w:t>Сцепное устройство СА-3</w:t>
       </w:r>
-      <w:bookmarkEnd w:id="41"/>
+      <w:bookmarkEnd w:id="43"/>
     </w:p>
     <w:p>
       <w:pPr>
@@ -8604,11 +9354,11 @@
       <w:pPr>
         <w:pStyle w:val="2"/>
       </w:pPr>
-      <w:bookmarkStart w:id="42" w:name="_Toc237014917"/>
+      <w:bookmarkStart w:id="44" w:name="_Toc237014917"/>
       <w:r>
         <w:t>Сцепное устройство Шарфенберга</w:t>
       </w:r>
-      <w:bookmarkEnd w:id="42"/>
+      <w:bookmarkEnd w:id="44"/>
     </w:p>
     <w:p>
       <w:pPr>
@@ -8648,12 +9398,12 @@
       </w:pPr>
     </w:p>
     <w:sectPr>
-      <w:headerReference w:type="even" r:id="rId8"/>
-      <w:headerReference w:type="default" r:id="rId9"/>
-      <w:footerReference w:type="even" r:id="rId10"/>
-      <w:footerReference w:type="default" r:id="rId11"/>
-      <w:headerReference w:type="first" r:id="rId12"/>
-      <w:footerReference w:type="first" r:id="rId13"/>
+      <w:headerReference w:type="even" r:id="rId16"/>
+      <w:headerReference w:type="default" r:id="rId17"/>
+      <w:footerReference w:type="even" r:id="rId18"/>
+      <w:footerReference w:type="default" r:id="rId19"/>
+      <w:headerReference w:type="first" r:id="rId20"/>
+      <w:footerReference w:type="first" r:id="rId21"/>
       <w:pgSz w:w="11906" w:h="16838"/>
       <w:pgMar w:top="1134" w:right="850" w:bottom="1134" w:left="1701" w:header="708" w:footer="708" w:gutter="0"/>
       <w:cols w:space="708"/>
@@ -10160,6 +10910,205 @@
     </w:lvl>
   </w:abstractNum>
   <w:abstractNum w:abstractNumId="11" w15:restartNumberingAfterBreak="0">
+    <w:nsid w:val="374B77EE"/>
+    <w:multiLevelType w:val="hybridMultilevel"/>
+    <w:tmpl w:val="953E0C9A"/>
+    <w:lvl w:ilvl="0" w:tplc="56E2A4EE">
+      <w:start w:val="1"/>
+      <w:numFmt w:val="bullet"/>
+      <w:lvlText w:val=""/>
+      <w:lvlJc w:val="left"/>
+      <w:pPr>
+        <w:ind w:left="720" w:hanging="360"/>
+      </w:pPr>
+      <w:rPr>
+        <w:rFonts w:ascii="Symbol" w:hAnsi="Symbol" w:hint="default"/>
+      </w:rPr>
+    </w:lvl>
+    <w:lvl w:ilvl="1" w:tplc="04190003" w:tentative="1">
+      <w:start w:val="1"/>
+      <w:numFmt w:val="bullet"/>
+      <w:lvlText w:val="o"/>
+      <w:lvlJc w:val="left"/>
+      <w:pPr>
+        <w:ind w:left="1440" w:hanging="360"/>
+      </w:pPr>
+      <w:rPr>
+        <w:rFonts w:ascii="Courier New" w:hAnsi="Courier New" w:cs="Courier New" w:hint="default"/>
+      </w:rPr>
+    </w:lvl>
+    <w:lvl w:ilvl="2" w:tplc="04190005" w:tentative="1">
+      <w:start w:val="1"/>
+      <w:numFmt w:val="bullet"/>
+      <w:lvlText w:val=""/>
+      <w:lvlJc w:val="left"/>
+      <w:pPr>
+        <w:ind w:left="2160" w:hanging="360"/>
+      </w:pPr>
+      <w:rPr>
+        <w:rFonts w:ascii="Wingdings" w:hAnsi="Wingdings" w:hint="default"/>
+      </w:rPr>
+    </w:lvl>
+    <w:lvl w:ilvl="3" w:tplc="04190001" w:tentative="1">
+      <w:start w:val="1"/>
+      <w:numFmt w:val="bullet"/>
+      <w:lvlText w:val=""/>
+      <w:lvlJc w:val="left"/>
+      <w:pPr>
+        <w:ind w:left="2880" w:hanging="360"/>
+      </w:pPr>
+      <w:rPr>
+        <w:rFonts w:ascii="Symbol" w:hAnsi="Symbol" w:hint="default"/>
+      </w:rPr>
+    </w:lvl>
+    <w:lvl w:ilvl="4" w:tplc="04190003" w:tentative="1">
+      <w:start w:val="1"/>
+      <w:numFmt w:val="bullet"/>
+      <w:lvlText w:val="o"/>
+      <w:lvlJc w:val="left"/>
+      <w:pPr>
+        <w:ind w:left="3600" w:hanging="360"/>
+      </w:pPr>
+      <w:rPr>
+        <w:rFonts w:ascii="Courier New" w:hAnsi="Courier New" w:cs="Courier New" w:hint="default"/>
+      </w:rPr>
+    </w:lvl>
+    <w:lvl w:ilvl="5" w:tplc="04190005" w:tentative="1">
+      <w:start w:val="1"/>
+      <w:numFmt w:val="bullet"/>
+      <w:lvlText w:val=""/>
+      <w:lvlJc w:val="left"/>
+      <w:pPr>
+        <w:ind w:left="4320" w:hanging="360"/>
+      </w:pPr>
+      <w:rPr>
+        <w:rFonts w:ascii="Wingdings" w:hAnsi="Wingdings" w:hint="default"/>
+      </w:rPr>
+    </w:lvl>
+    <w:lvl w:ilvl="6" w:tplc="04190001" w:tentative="1">
+      <w:start w:val="1"/>
+      <w:numFmt w:val="bullet"/>
+      <w:lvlText w:val=""/>
+      <w:lvlJc w:val="left"/>
+      <w:pPr>
+        <w:ind w:left="5040" w:hanging="360"/>
+      </w:pPr>
+      <w:rPr>
+        <w:rFonts w:ascii="Symbol" w:hAnsi="Symbol" w:hint="default"/>
+      </w:rPr>
+    </w:lvl>
+    <w:lvl w:ilvl="7" w:tplc="04190003" w:tentative="1">
+      <w:start w:val="1"/>
+      <w:numFmt w:val="bullet"/>
+      <w:lvlText w:val="o"/>
+      <w:lvlJc w:val="left"/>
+      <w:pPr>
+        <w:ind w:left="5760" w:hanging="360"/>
+      </w:pPr>
+      <w:rPr>
+        <w:rFonts w:ascii="Courier New" w:hAnsi="Courier New" w:cs="Courier New" w:hint="default"/>
+      </w:rPr>
+    </w:lvl>
+    <w:lvl w:ilvl="8" w:tplc="04190005" w:tentative="1">
+      <w:start w:val="1"/>
+      <w:numFmt w:val="bullet"/>
+      <w:lvlText w:val=""/>
+      <w:lvlJc w:val="left"/>
+      <w:pPr>
+        <w:ind w:left="6480" w:hanging="360"/>
+      </w:pPr>
+      <w:rPr>
+        <w:rFonts w:ascii="Wingdings" w:hAnsi="Wingdings" w:hint="default"/>
+      </w:rPr>
+    </w:lvl>
+  </w:abstractNum>
+  <w:abstractNum w:abstractNumId="12" w15:restartNumberingAfterBreak="0">
+    <w:nsid w:val="377F50D6"/>
+    <w:multiLevelType w:val="multilevel"/>
+    <w:tmpl w:val="0419001F"/>
+    <w:lvl w:ilvl="0">
+      <w:start w:val="1"/>
+      <w:numFmt w:val="decimal"/>
+      <w:lvlText w:val="%1."/>
+      <w:lvlJc w:val="left"/>
+      <w:pPr>
+        <w:ind w:left="360" w:hanging="360"/>
+      </w:pPr>
+    </w:lvl>
+    <w:lvl w:ilvl="1">
+      <w:start w:val="1"/>
+      <w:numFmt w:val="decimal"/>
+      <w:lvlText w:val="%1.%2."/>
+      <w:lvlJc w:val="left"/>
+      <w:pPr>
+        <w:ind w:left="792" w:hanging="432"/>
+      </w:pPr>
+    </w:lvl>
+    <w:lvl w:ilvl="2">
+      <w:start w:val="1"/>
+      <w:numFmt w:val="decimal"/>
+      <w:lvlText w:val="%1.%2.%3."/>
+      <w:lvlJc w:val="left"/>
+      <w:pPr>
+        <w:ind w:left="1224" w:hanging="504"/>
+      </w:pPr>
+    </w:lvl>
+    <w:lvl w:ilvl="3">
+      <w:start w:val="1"/>
+      <w:numFmt w:val="decimal"/>
+      <w:lvlText w:val="%1.%2.%3.%4."/>
+      <w:lvlJc w:val="left"/>
+      <w:pPr>
+        <w:ind w:left="1728" w:hanging="648"/>
+      </w:pPr>
+    </w:lvl>
+    <w:lvl w:ilvl="4">
+      <w:start w:val="1"/>
+      <w:numFmt w:val="decimal"/>
+      <w:lvlText w:val="%1.%2.%3.%4.%5."/>
+      <w:lvlJc w:val="left"/>
+      <w:pPr>
+        <w:ind w:left="2232" w:hanging="792"/>
+      </w:pPr>
+    </w:lvl>
+    <w:lvl w:ilvl="5">
+      <w:start w:val="1"/>
+      <w:numFmt w:val="decimal"/>
+      <w:lvlText w:val="%1.%2.%3.%4.%5.%6."/>
+      <w:lvlJc w:val="left"/>
+      <w:pPr>
+        <w:ind w:left="2736" w:hanging="936"/>
+      </w:pPr>
+    </w:lvl>
+    <w:lvl w:ilvl="6">
+      <w:start w:val="1"/>
+      <w:numFmt w:val="decimal"/>
+      <w:lvlText w:val="%1.%2.%3.%4.%5.%6.%7."/>
+      <w:lvlJc w:val="left"/>
+      <w:pPr>
+        <w:ind w:left="3240" w:hanging="1080"/>
+      </w:pPr>
+    </w:lvl>
+    <w:lvl w:ilvl="7">
+      <w:start w:val="1"/>
+      <w:numFmt w:val="decimal"/>
+      <w:lvlText w:val="%1.%2.%3.%4.%5.%6.%7.%8."/>
+      <w:lvlJc w:val="left"/>
+      <w:pPr>
+        <w:ind w:left="3744" w:hanging="1224"/>
+      </w:pPr>
+    </w:lvl>
+    <w:lvl w:ilvl="8">
+      <w:start w:val="1"/>
+      <w:numFmt w:val="decimal"/>
+      <w:lvlText w:val="%1.%2.%3.%4.%5.%6.%7.%8.%9."/>
+      <w:lvlJc w:val="left"/>
+      <w:pPr>
+        <w:ind w:left="4320" w:hanging="1440"/>
+      </w:pPr>
+    </w:lvl>
+  </w:abstractNum>
+  <w:abstractNum w:abstractNumId="13" w15:restartNumberingAfterBreak="0">
     <w:nsid w:val="428E154E"/>
     <w:multiLevelType w:val="hybridMultilevel"/>
     <w:tmpl w:val="0A2A3598"/>
@@ -10245,7 +11194,7 @@
       </w:pPr>
     </w:lvl>
   </w:abstractNum>
-  <w:abstractNum w:abstractNumId="12" w15:restartNumberingAfterBreak="0">
+  <w:abstractNum w:abstractNumId="14" w15:restartNumberingAfterBreak="0">
     <w:nsid w:val="4DBD18DF"/>
     <w:multiLevelType w:val="hybridMultilevel"/>
     <w:tmpl w:val="AE928E20"/>
@@ -10331,7 +11280,7 @@
       </w:pPr>
     </w:lvl>
   </w:abstractNum>
-  <w:abstractNum w:abstractNumId="13" w15:restartNumberingAfterBreak="0">
+  <w:abstractNum w:abstractNumId="15" w15:restartNumberingAfterBreak="0">
     <w:nsid w:val="4F720130"/>
     <w:multiLevelType w:val="hybridMultilevel"/>
     <w:tmpl w:val="898E7F0A"/>
@@ -10417,7 +11366,233 @@
       </w:pPr>
     </w:lvl>
   </w:abstractNum>
-  <w:abstractNum w:abstractNumId="14" w15:restartNumberingAfterBreak="0">
+  <w:abstractNum w:abstractNumId="16" w15:restartNumberingAfterBreak="0">
+    <w:nsid w:val="53F240CB"/>
+    <w:multiLevelType w:val="hybridMultilevel"/>
+    <w:tmpl w:val="32FE83D2"/>
+    <w:lvl w:ilvl="0" w:tplc="56E2A4EE">
+      <w:start w:val="1"/>
+      <w:numFmt w:val="bullet"/>
+      <w:lvlText w:val=""/>
+      <w:lvlJc w:val="left"/>
+      <w:pPr>
+        <w:ind w:left="720" w:hanging="360"/>
+      </w:pPr>
+      <w:rPr>
+        <w:rFonts w:ascii="Symbol" w:hAnsi="Symbol" w:hint="default"/>
+      </w:rPr>
+    </w:lvl>
+    <w:lvl w:ilvl="1" w:tplc="04190003" w:tentative="1">
+      <w:start w:val="1"/>
+      <w:numFmt w:val="bullet"/>
+      <w:lvlText w:val="o"/>
+      <w:lvlJc w:val="left"/>
+      <w:pPr>
+        <w:ind w:left="1440" w:hanging="360"/>
+      </w:pPr>
+      <w:rPr>
+        <w:rFonts w:ascii="Courier New" w:hAnsi="Courier New" w:cs="Courier New" w:hint="default"/>
+      </w:rPr>
+    </w:lvl>
+    <w:lvl w:ilvl="2" w:tplc="04190005" w:tentative="1">
+      <w:start w:val="1"/>
+      <w:numFmt w:val="bullet"/>
+      <w:lvlText w:val=""/>
+      <w:lvlJc w:val="left"/>
+      <w:pPr>
+        <w:ind w:left="2160" w:hanging="360"/>
+      </w:pPr>
+      <w:rPr>
+        <w:rFonts w:ascii="Wingdings" w:hAnsi="Wingdings" w:hint="default"/>
+      </w:rPr>
+    </w:lvl>
+    <w:lvl w:ilvl="3" w:tplc="04190001" w:tentative="1">
+      <w:start w:val="1"/>
+      <w:numFmt w:val="bullet"/>
+      <w:lvlText w:val=""/>
+      <w:lvlJc w:val="left"/>
+      <w:pPr>
+        <w:ind w:left="2880" w:hanging="360"/>
+      </w:pPr>
+      <w:rPr>
+        <w:rFonts w:ascii="Symbol" w:hAnsi="Symbol" w:hint="default"/>
+      </w:rPr>
+    </w:lvl>
+    <w:lvl w:ilvl="4" w:tplc="04190003" w:tentative="1">
+      <w:start w:val="1"/>
+      <w:numFmt w:val="bullet"/>
+      <w:lvlText w:val="o"/>
+      <w:lvlJc w:val="left"/>
+      <w:pPr>
+        <w:ind w:left="3600" w:hanging="360"/>
+      </w:pPr>
+      <w:rPr>
+        <w:rFonts w:ascii="Courier New" w:hAnsi="Courier New" w:cs="Courier New" w:hint="default"/>
+      </w:rPr>
+    </w:lvl>
+    <w:lvl w:ilvl="5" w:tplc="04190005" w:tentative="1">
+      <w:start w:val="1"/>
+      <w:numFmt w:val="bullet"/>
+      <w:lvlText w:val=""/>
+      <w:lvlJc w:val="left"/>
+      <w:pPr>
+        <w:ind w:left="4320" w:hanging="360"/>
+      </w:pPr>
+      <w:rPr>
+        <w:rFonts w:ascii="Wingdings" w:hAnsi="Wingdings" w:hint="default"/>
+      </w:rPr>
+    </w:lvl>
+    <w:lvl w:ilvl="6" w:tplc="04190001" w:tentative="1">
+      <w:start w:val="1"/>
+      <w:numFmt w:val="bullet"/>
+      <w:lvlText w:val=""/>
+      <w:lvlJc w:val="left"/>
+      <w:pPr>
+        <w:ind w:left="5040" w:hanging="360"/>
+      </w:pPr>
+      <w:rPr>
+        <w:rFonts w:ascii="Symbol" w:hAnsi="Symbol" w:hint="default"/>
+      </w:rPr>
+    </w:lvl>
+    <w:lvl w:ilvl="7" w:tplc="04190003" w:tentative="1">
+      <w:start w:val="1"/>
+      <w:numFmt w:val="bullet"/>
+      <w:lvlText w:val="o"/>
+      <w:lvlJc w:val="left"/>
+      <w:pPr>
+        <w:ind w:left="5760" w:hanging="360"/>
+      </w:pPr>
+      <w:rPr>
+        <w:rFonts w:ascii="Courier New" w:hAnsi="Courier New" w:cs="Courier New" w:hint="default"/>
+      </w:rPr>
+    </w:lvl>
+    <w:lvl w:ilvl="8" w:tplc="04190005" w:tentative="1">
+      <w:start w:val="1"/>
+      <w:numFmt w:val="bullet"/>
+      <w:lvlText w:val=""/>
+      <w:lvlJc w:val="left"/>
+      <w:pPr>
+        <w:ind w:left="6480" w:hanging="360"/>
+      </w:pPr>
+      <w:rPr>
+        <w:rFonts w:ascii="Wingdings" w:hAnsi="Wingdings" w:hint="default"/>
+      </w:rPr>
+    </w:lvl>
+  </w:abstractNum>
+  <w:abstractNum w:abstractNumId="17" w15:restartNumberingAfterBreak="0">
+    <w:nsid w:val="550445B0"/>
+    <w:multiLevelType w:val="hybridMultilevel"/>
+    <w:tmpl w:val="5A34FD76"/>
+    <w:lvl w:ilvl="0" w:tplc="56E2A4EE">
+      <w:start w:val="1"/>
+      <w:numFmt w:val="bullet"/>
+      <w:lvlText w:val=""/>
+      <w:lvlJc w:val="left"/>
+      <w:pPr>
+        <w:ind w:left="720" w:hanging="360"/>
+      </w:pPr>
+      <w:rPr>
+        <w:rFonts w:ascii="Symbol" w:hAnsi="Symbol" w:hint="default"/>
+      </w:rPr>
+    </w:lvl>
+    <w:lvl w:ilvl="1" w:tplc="04190003" w:tentative="1">
+      <w:start w:val="1"/>
+      <w:numFmt w:val="bullet"/>
+      <w:lvlText w:val="o"/>
+      <w:lvlJc w:val="left"/>
+      <w:pPr>
+        <w:ind w:left="1440" w:hanging="360"/>
+      </w:pPr>
+      <w:rPr>
+        <w:rFonts w:ascii="Courier New" w:hAnsi="Courier New" w:cs="Courier New" w:hint="default"/>
+      </w:rPr>
+    </w:lvl>
+    <w:lvl w:ilvl="2" w:tplc="04190005" w:tentative="1">
+      <w:start w:val="1"/>
+      <w:numFmt w:val="bullet"/>
+      <w:lvlText w:val=""/>
+      <w:lvlJc w:val="left"/>
+      <w:pPr>
+        <w:ind w:left="2160" w:hanging="360"/>
+      </w:pPr>
+      <w:rPr>
+        <w:rFonts w:ascii="Wingdings" w:hAnsi="Wingdings" w:hint="default"/>
+      </w:rPr>
+    </w:lvl>
+    <w:lvl w:ilvl="3" w:tplc="04190001" w:tentative="1">
+      <w:start w:val="1"/>
+      <w:numFmt w:val="bullet"/>
+      <w:lvlText w:val=""/>
+      <w:lvlJc w:val="left"/>
+      <w:pPr>
+        <w:ind w:left="2880" w:hanging="360"/>
+      </w:pPr>
+      <w:rPr>
+        <w:rFonts w:ascii="Symbol" w:hAnsi="Symbol" w:hint="default"/>
+      </w:rPr>
+    </w:lvl>
+    <w:lvl w:ilvl="4" w:tplc="04190003" w:tentative="1">
+      <w:start w:val="1"/>
+      <w:numFmt w:val="bullet"/>
+      <w:lvlText w:val="o"/>
+      <w:lvlJc w:val="left"/>
+      <w:pPr>
+        <w:ind w:left="3600" w:hanging="360"/>
+      </w:pPr>
+      <w:rPr>
+        <w:rFonts w:ascii="Courier New" w:hAnsi="Courier New" w:cs="Courier New" w:hint="default"/>
+      </w:rPr>
+    </w:lvl>
+    <w:lvl w:ilvl="5" w:tplc="04190005" w:tentative="1">
+      <w:start w:val="1"/>
+      <w:numFmt w:val="bullet"/>
+      <w:lvlText w:val=""/>
+      <w:lvlJc w:val="left"/>
+      <w:pPr>
+        <w:ind w:left="4320" w:hanging="360"/>
+      </w:pPr>
+      <w:rPr>
+        <w:rFonts w:ascii="Wingdings" w:hAnsi="Wingdings" w:hint="default"/>
+      </w:rPr>
+    </w:lvl>
+    <w:lvl w:ilvl="6" w:tplc="04190001" w:tentative="1">
+      <w:start w:val="1"/>
+      <w:numFmt w:val="bullet"/>
+      <w:lvlText w:val=""/>
+      <w:lvlJc w:val="left"/>
+      <w:pPr>
+        <w:ind w:left="5040" w:hanging="360"/>
+      </w:pPr>
+      <w:rPr>
+        <w:rFonts w:ascii="Symbol" w:hAnsi="Symbol" w:hint="default"/>
+      </w:rPr>
+    </w:lvl>
+    <w:lvl w:ilvl="7" w:tplc="04190003" w:tentative="1">
+      <w:start w:val="1"/>
+      <w:numFmt w:val="bullet"/>
+      <w:lvlText w:val="o"/>
+      <w:lvlJc w:val="left"/>
+      <w:pPr>
+        <w:ind w:left="5760" w:hanging="360"/>
+      </w:pPr>
+      <w:rPr>
+        <w:rFonts w:ascii="Courier New" w:hAnsi="Courier New" w:cs="Courier New" w:hint="default"/>
+      </w:rPr>
+    </w:lvl>
+    <w:lvl w:ilvl="8" w:tplc="04190005" w:tentative="1">
+      <w:start w:val="1"/>
+      <w:numFmt w:val="bullet"/>
+      <w:lvlText w:val=""/>
+      <w:lvlJc w:val="left"/>
+      <w:pPr>
+        <w:ind w:left="6480" w:hanging="360"/>
+      </w:pPr>
+      <w:rPr>
+        <w:rFonts w:ascii="Wingdings" w:hAnsi="Wingdings" w:hint="default"/>
+      </w:rPr>
+    </w:lvl>
+  </w:abstractNum>
+  <w:abstractNum w:abstractNumId="18" w15:restartNumberingAfterBreak="0">
     <w:nsid w:val="5B243F0B"/>
     <w:multiLevelType w:val="hybridMultilevel"/>
     <w:tmpl w:val="65A84A1C"/>
@@ -10506,7 +11681,7 @@
       </w:pPr>
     </w:lvl>
   </w:abstractNum>
-  <w:abstractNum w:abstractNumId="15" w15:restartNumberingAfterBreak="0">
+  <w:abstractNum w:abstractNumId="19" w15:restartNumberingAfterBreak="0">
     <w:nsid w:val="67DB06EC"/>
     <w:multiLevelType w:val="hybridMultilevel"/>
     <w:tmpl w:val="8E5CC764"/>
@@ -10592,7 +11767,7 @@
       </w:pPr>
     </w:lvl>
   </w:abstractNum>
-  <w:abstractNum w:abstractNumId="16" w15:restartNumberingAfterBreak="0">
+  <w:abstractNum w:abstractNumId="20" w15:restartNumberingAfterBreak="0">
     <w:nsid w:val="6AA167BF"/>
     <w:multiLevelType w:val="hybridMultilevel"/>
     <w:tmpl w:val="C3C606CE"/>
@@ -10676,6 +11851,119 @@
       <w:pPr>
         <w:ind w:left="6480" w:hanging="180"/>
       </w:pPr>
+    </w:lvl>
+  </w:abstractNum>
+  <w:abstractNum w:abstractNumId="21" w15:restartNumberingAfterBreak="0">
+    <w:nsid w:val="79CC4C74"/>
+    <w:multiLevelType w:val="hybridMultilevel"/>
+    <w:tmpl w:val="623AB5C2"/>
+    <w:lvl w:ilvl="0" w:tplc="56E2A4EE">
+      <w:start w:val="1"/>
+      <w:numFmt w:val="bullet"/>
+      <w:lvlText w:val=""/>
+      <w:lvlJc w:val="left"/>
+      <w:pPr>
+        <w:ind w:left="720" w:hanging="360"/>
+      </w:pPr>
+      <w:rPr>
+        <w:rFonts w:ascii="Symbol" w:hAnsi="Symbol" w:hint="default"/>
+      </w:rPr>
+    </w:lvl>
+    <w:lvl w:ilvl="1" w:tplc="04190003" w:tentative="1">
+      <w:start w:val="1"/>
+      <w:numFmt w:val="bullet"/>
+      <w:lvlText w:val="o"/>
+      <w:lvlJc w:val="left"/>
+      <w:pPr>
+        <w:ind w:left="1440" w:hanging="360"/>
+      </w:pPr>
+      <w:rPr>
+        <w:rFonts w:ascii="Courier New" w:hAnsi="Courier New" w:cs="Courier New" w:hint="default"/>
+      </w:rPr>
+    </w:lvl>
+    <w:lvl w:ilvl="2" w:tplc="04190005" w:tentative="1">
+      <w:start w:val="1"/>
+      <w:numFmt w:val="bullet"/>
+      <w:lvlText w:val=""/>
+      <w:lvlJc w:val="left"/>
+      <w:pPr>
+        <w:ind w:left="2160" w:hanging="360"/>
+      </w:pPr>
+      <w:rPr>
+        <w:rFonts w:ascii="Wingdings" w:hAnsi="Wingdings" w:hint="default"/>
+      </w:rPr>
+    </w:lvl>
+    <w:lvl w:ilvl="3" w:tplc="04190001" w:tentative="1">
+      <w:start w:val="1"/>
+      <w:numFmt w:val="bullet"/>
+      <w:lvlText w:val=""/>
+      <w:lvlJc w:val="left"/>
+      <w:pPr>
+        <w:ind w:left="2880" w:hanging="360"/>
+      </w:pPr>
+      <w:rPr>
+        <w:rFonts w:ascii="Symbol" w:hAnsi="Symbol" w:hint="default"/>
+      </w:rPr>
+    </w:lvl>
+    <w:lvl w:ilvl="4" w:tplc="04190003" w:tentative="1">
+      <w:start w:val="1"/>
+      <w:numFmt w:val="bullet"/>
+      <w:lvlText w:val="o"/>
+      <w:lvlJc w:val="left"/>
+      <w:pPr>
+        <w:ind w:left="3600" w:hanging="360"/>
+      </w:pPr>
+      <w:rPr>
+        <w:rFonts w:ascii="Courier New" w:hAnsi="Courier New" w:cs="Courier New" w:hint="default"/>
+      </w:rPr>
+    </w:lvl>
+    <w:lvl w:ilvl="5" w:tplc="04190005" w:tentative="1">
+      <w:start w:val="1"/>
+      <w:numFmt w:val="bullet"/>
+      <w:lvlText w:val=""/>
+      <w:lvlJc w:val="left"/>
+      <w:pPr>
+        <w:ind w:left="4320" w:hanging="360"/>
+      </w:pPr>
+      <w:rPr>
+        <w:rFonts w:ascii="Wingdings" w:hAnsi="Wingdings" w:hint="default"/>
+      </w:rPr>
+    </w:lvl>
+    <w:lvl w:ilvl="6" w:tplc="04190001" w:tentative="1">
+      <w:start w:val="1"/>
+      <w:numFmt w:val="bullet"/>
+      <w:lvlText w:val=""/>
+      <w:lvlJc w:val="left"/>
+      <w:pPr>
+        <w:ind w:left="5040" w:hanging="360"/>
+      </w:pPr>
+      <w:rPr>
+        <w:rFonts w:ascii="Symbol" w:hAnsi="Symbol" w:hint="default"/>
+      </w:rPr>
+    </w:lvl>
+    <w:lvl w:ilvl="7" w:tplc="04190003" w:tentative="1">
+      <w:start w:val="1"/>
+      <w:numFmt w:val="bullet"/>
+      <w:lvlText w:val="o"/>
+      <w:lvlJc w:val="left"/>
+      <w:pPr>
+        <w:ind w:left="5760" w:hanging="360"/>
+      </w:pPr>
+      <w:rPr>
+        <w:rFonts w:ascii="Courier New" w:hAnsi="Courier New" w:cs="Courier New" w:hint="default"/>
+      </w:rPr>
+    </w:lvl>
+    <w:lvl w:ilvl="8" w:tplc="04190005" w:tentative="1">
+      <w:start w:val="1"/>
+      <w:numFmt w:val="bullet"/>
+      <w:lvlText w:val=""/>
+      <w:lvlJc w:val="left"/>
+      <w:pPr>
+        <w:ind w:left="6480" w:hanging="360"/>
+      </w:pPr>
+      <w:rPr>
+        <w:rFonts w:ascii="Wingdings" w:hAnsi="Wingdings" w:hint="default"/>
+      </w:rPr>
     </w:lvl>
   </w:abstractNum>
   <w:num w:numId="1" w16cid:durableId="2018461504">
@@ -10685,10 +11973,10 @@
     <w:abstractNumId w:val="0"/>
   </w:num>
   <w:num w:numId="3" w16cid:durableId="667713350">
-    <w:abstractNumId w:val="16"/>
+    <w:abstractNumId w:val="20"/>
   </w:num>
   <w:num w:numId="4" w16cid:durableId="922300437">
-    <w:abstractNumId w:val="13"/>
+    <w:abstractNumId w:val="15"/>
   </w:num>
   <w:num w:numId="5" w16cid:durableId="391512474">
     <w:abstractNumId w:val="6"/>
@@ -10706,7 +11994,7 @@
     <w:abstractNumId w:val="5"/>
   </w:num>
   <w:num w:numId="10" w16cid:durableId="469330165">
-    <w:abstractNumId w:val="14"/>
+    <w:abstractNumId w:val="18"/>
   </w:num>
   <w:num w:numId="11" w16cid:durableId="977877113">
     <w:abstractNumId w:val="7"/>
@@ -10718,15 +12006,30 @@
     <w:abstractNumId w:val="2"/>
   </w:num>
   <w:num w:numId="14" w16cid:durableId="139418748">
-    <w:abstractNumId w:val="12"/>
+    <w:abstractNumId w:val="14"/>
   </w:num>
   <w:num w:numId="15" w16cid:durableId="1773359944">
     <w:abstractNumId w:val="10"/>
   </w:num>
   <w:num w:numId="16" w16cid:durableId="395010737">
-    <w:abstractNumId w:val="15"/>
+    <w:abstractNumId w:val="19"/>
   </w:num>
   <w:num w:numId="17" w16cid:durableId="941304105">
+    <w:abstractNumId w:val="13"/>
+  </w:num>
+  <w:num w:numId="18" w16cid:durableId="622885470">
+    <w:abstractNumId w:val="12"/>
+  </w:num>
+  <w:num w:numId="19" w16cid:durableId="1843470546">
+    <w:abstractNumId w:val="16"/>
+  </w:num>
+  <w:num w:numId="20" w16cid:durableId="1127312589">
+    <w:abstractNumId w:val="17"/>
+  </w:num>
+  <w:num w:numId="21" w16cid:durableId="618145353">
+    <w:abstractNumId w:val="21"/>
+  </w:num>
+  <w:num w:numId="22" w16cid:durableId="121774496">
     <w:abstractNumId w:val="11"/>
   </w:num>
 </w:numbering>
@@ -11861,6 +13164,28 @@
       <w:szCs w:val="18"/>
     </w:rPr>
   </w:style>
+  <w:style w:type="character" w:styleId="af8">
+    <w:name w:val="FollowedHyperlink"/>
+    <w:basedOn w:val="a0"/>
+    <w:uiPriority w:val="99"/>
+    <w:semiHidden/>
+    <w:unhideWhenUsed/>
+    <w:rsid w:val="00425635"/>
+    <w:rPr>
+      <w:color w:val="96607D" w:themeColor="followedHyperlink"/>
+      <w:u w:val="single"/>
+    </w:rPr>
+  </w:style>
+  <w:style w:type="character" w:styleId="af9">
+    <w:name w:val="Placeholder Text"/>
+    <w:basedOn w:val="a0"/>
+    <w:uiPriority w:val="99"/>
+    <w:semiHidden/>
+    <w:rsid w:val="009E3DFF"/>
+    <w:rPr>
+      <w:color w:val="666666"/>
+    </w:rPr>
+  </w:style>
 </w:styles>
 </file>
 

</xml_diff>

<commit_message>
Auto update 10.08.2026 16:26:47,77
</commit_message>
<xml_diff>
--- a/Стандарт №3 проектирования железнодорожной техники в Stormworks Build&Rescue от 07.08.2026 г..docx
+++ b/Стандарт №3 проектирования железнодорожной техники в Stormworks Build&Rescue от 07.08.2026 г..docx
@@ -7899,13 +7899,19 @@
         <w:t xml:space="preserve"> </w:t>
       </w:r>
       <w:r>
-        <w:t>6</w:t>
+        <w:rPr>
+          <w:lang w:val="en-US"/>
+        </w:rPr>
+        <w:t>X</w:t>
       </w:r>
       <w:r>
         <w:t xml:space="preserve"> на </w:t>
       </w:r>
       <w:r>
-        <w:t>3</w:t>
+        <w:rPr>
+          <w:lang w:val="en-US"/>
+        </w:rPr>
+        <w:t>Y</w:t>
       </w:r>
       <w:r>
         <w:t>, который имеет следующую структуру:</w:t>
@@ -8636,26 +8642,79 @@
     </w:p>
     <w:p>
       <w:pPr>
-        <w:jc w:val="both"/>
-      </w:pPr>
-      <w:r>
-        <w:t>*Вставить фото структуры*</w:t>
-      </w:r>
-    </w:p>
-    <w:p>
-      <w:pPr>
-        <w:jc w:val="both"/>
-      </w:pPr>
-      <w:r>
-        <w:t>*Описать логические входы*</w:t>
-      </w:r>
-    </w:p>
-    <w:p>
-      <w:pPr>
-        <w:jc w:val="both"/>
-      </w:pPr>
-      <w:r>
-        <w:t>*Описать принцип взаимодействия микроконтроллера и игрока*</w:t>
+        <w:jc w:val="center"/>
+        <w:rPr>
+          <w:lang w:val="en-US"/>
+        </w:rPr>
+      </w:pPr>
+      <w:r>
+        <w:rPr>
+          <w:noProof/>
+        </w:rPr>
+        <w:drawing>
+          <wp:inline distT="0" distB="0" distL="0" distR="0" wp14:anchorId="6948E2F3" wp14:editId="446D2EC0">
+            <wp:extent cx="3117600" cy="3290400"/>
+            <wp:effectExtent l="0" t="0" r="6985" b="5715"/>
+            <wp:docPr id="7" name="Рисунок 7"/>
+            <wp:cNvGraphicFramePr>
+              <a:graphicFrameLocks xmlns:a="http://schemas.openxmlformats.org/drawingml/2006/main" noChangeAspect="1"/>
+            </wp:cNvGraphicFramePr>
+            <a:graphic xmlns:a="http://schemas.openxmlformats.org/drawingml/2006/main">
+              <a:graphicData uri="http://schemas.openxmlformats.org/drawingml/2006/picture">
+                <pic:pic xmlns:pic="http://schemas.openxmlformats.org/drawingml/2006/picture">
+                  <pic:nvPicPr>
+                    <pic:cNvPr id="1" name=""/>
+                    <pic:cNvPicPr/>
+                  </pic:nvPicPr>
+                  <pic:blipFill>
+                    <a:blip r:embed="rId16">
+                      <a:extLst>
+                        <a:ext uri="{96DAC541-7B7A-43D3-8B79-37D633B846F1}">
+                          <asvg:svgBlip xmlns:asvg="http://schemas.microsoft.com/office/drawing/2016/SVG/main" r:embed="rId17"/>
+                        </a:ext>
+                      </a:extLst>
+                    </a:blip>
+                    <a:stretch>
+                      <a:fillRect/>
+                    </a:stretch>
+                  </pic:blipFill>
+                  <pic:spPr>
+                    <a:xfrm>
+                      <a:off x="0" y="0"/>
+                      <a:ext cx="3117600" cy="3290400"/>
+                    </a:xfrm>
+                    <a:prstGeom prst="rect">
+                      <a:avLst/>
+                    </a:prstGeom>
+                  </pic:spPr>
+                </pic:pic>
+              </a:graphicData>
+            </a:graphic>
+          </wp:inline>
+        </w:drawing>
+      </w:r>
+    </w:p>
+    <w:p>
+      <w:pPr>
+        <w:jc w:val="both"/>
+        <w:rPr>
+          <w:lang w:val="en-US"/>
+        </w:rPr>
+      </w:pPr>
+      <w:r>
+        <w:rPr>
+          <w:lang w:val="en-US"/>
+        </w:rPr>
+        <w:t>*</w:t>
+      </w:r>
+      <w:r>
+        <w:t>ОПИСАТЬ</w:t>
+      </w:r>
+      <w:r>
+        <w:rPr>
+          <w:lang w:val="en-US"/>
+        </w:rPr>
+        <w:t>*</w:t>
       </w:r>
     </w:p>
     <w:p>
@@ -8676,25 +8735,46 @@
         <w:br w:type="page"/>
       </w:r>
     </w:p>
+    <w:bookmarkEnd w:id="30"/>
     <w:p>
       <w:pPr>
         <w:pStyle w:val="2"/>
+        <w:rPr>
+          <w:lang w:val="en-US"/>
+        </w:rPr>
       </w:pPr>
       <w:r>
         <w:rPr>
           <w:lang w:val="en-US"/>
         </w:rPr>
         <w:lastRenderedPageBreak/>
-        <w:t>Vigilance</w:t>
+        <w:t xml:space="preserve">Universal Machinist Alertness Controller </w:t>
+      </w:r>
+      <w:r>
+        <w:rPr>
+          <w:lang w:val="en-US"/>
+        </w:rPr>
+        <w:t>V</w:t>
+      </w:r>
+      <w:r>
+        <w:rPr>
+          <w:lang w:val="en-US"/>
+        </w:rPr>
+        <w:t>2</w:t>
+      </w:r>
+    </w:p>
+    <w:p>
+      <w:pPr>
+        <w:jc w:val="both"/>
+      </w:pPr>
+      <w:r>
+        <w:t>Микроконтроллер</w:t>
       </w:r>
       <w:r>
         <w:t xml:space="preserve"> </w:t>
       </w:r>
       <w:r>
-        <w:rPr>
-          <w:lang w:val="en-US"/>
-        </w:rPr>
-        <w:t>Devices</w:t>
+        <w:t>размером</w:t>
       </w:r>
       <w:r>
         <w:t xml:space="preserve"> </w:t>
@@ -8703,33 +8783,6 @@
         <w:rPr>
           <w:lang w:val="en-US"/>
         </w:rPr>
-        <w:t>V</w:t>
-      </w:r>
-      <w:r>
-        <w:t>2</w:t>
-      </w:r>
-      <w:bookmarkEnd w:id="30"/>
-    </w:p>
-    <w:p>
-      <w:pPr>
-        <w:jc w:val="both"/>
-      </w:pPr>
-      <w:r>
-        <w:t>Микроконтроллер</w:t>
-      </w:r>
-      <w:r>
-        <w:t xml:space="preserve"> </w:t>
-      </w:r>
-      <w:r>
-        <w:t>размером</w:t>
-      </w:r>
-      <w:r>
-        <w:t xml:space="preserve"> </w:t>
-      </w:r>
-      <w:r>
-        <w:rPr>
-          <w:lang w:val="en-US"/>
-        </w:rPr>
         <w:t>X</w:t>
       </w:r>
       <w:r>
@@ -8747,26 +8800,80 @@
     </w:p>
     <w:p>
       <w:pPr>
-        <w:jc w:val="both"/>
-      </w:pPr>
-      <w:r>
-        <w:t>*Вставить фото структуры*</w:t>
-      </w:r>
-    </w:p>
-    <w:p>
-      <w:pPr>
-        <w:jc w:val="both"/>
-      </w:pPr>
-      <w:r>
-        <w:t>*Описать логические входы*</w:t>
-      </w:r>
-    </w:p>
-    <w:p>
-      <w:pPr>
-        <w:jc w:val="both"/>
-      </w:pPr>
-      <w:r>
-        <w:t>*Описать принцип взаимодействия микроконтроллера и игрока*</w:t>
+        <w:jc w:val="center"/>
+        <w:rPr>
+          <w:lang w:val="en-US"/>
+        </w:rPr>
+      </w:pPr>
+      <w:r>
+        <w:rPr>
+          <w:noProof/>
+          <w:lang w:val="en-US"/>
+        </w:rPr>
+        <w:drawing>
+          <wp:inline distT="0" distB="0" distL="0" distR="0" wp14:anchorId="476B87E2" wp14:editId="6DCC5F2A">
+            <wp:extent cx="4489200" cy="3290400"/>
+            <wp:effectExtent l="0" t="0" r="6985" b="5715"/>
+            <wp:docPr id="8" name="Рисунок 8"/>
+            <wp:cNvGraphicFramePr>
+              <a:graphicFrameLocks xmlns:a="http://schemas.openxmlformats.org/drawingml/2006/main" noChangeAspect="1"/>
+            </wp:cNvGraphicFramePr>
+            <a:graphic xmlns:a="http://schemas.openxmlformats.org/drawingml/2006/main">
+              <a:graphicData uri="http://schemas.openxmlformats.org/drawingml/2006/picture">
+                <pic:pic xmlns:pic="http://schemas.openxmlformats.org/drawingml/2006/picture">
+                  <pic:nvPicPr>
+                    <pic:cNvPr id="8" name="Рисунок 8"/>
+                    <pic:cNvPicPr/>
+                  </pic:nvPicPr>
+                  <pic:blipFill>
+                    <a:blip r:embed="rId18">
+                      <a:extLst>
+                        <a:ext uri="{96DAC541-7B7A-43D3-8B79-37D633B846F1}">
+                          <asvg:svgBlip xmlns:asvg="http://schemas.microsoft.com/office/drawing/2016/SVG/main" r:embed="rId19"/>
+                        </a:ext>
+                      </a:extLst>
+                    </a:blip>
+                    <a:stretch>
+                      <a:fillRect/>
+                    </a:stretch>
+                  </pic:blipFill>
+                  <pic:spPr>
+                    <a:xfrm>
+                      <a:off x="0" y="0"/>
+                      <a:ext cx="4489200" cy="3290400"/>
+                    </a:xfrm>
+                    <a:prstGeom prst="rect">
+                      <a:avLst/>
+                    </a:prstGeom>
+                  </pic:spPr>
+                </pic:pic>
+              </a:graphicData>
+            </a:graphic>
+          </wp:inline>
+        </w:drawing>
+      </w:r>
+    </w:p>
+    <w:p>
+      <w:pPr>
+        <w:jc w:val="both"/>
+        <w:rPr>
+          <w:lang w:val="en-US"/>
+        </w:rPr>
+      </w:pPr>
+      <w:r>
+        <w:rPr>
+          <w:lang w:val="en-US"/>
+        </w:rPr>
+        <w:t>*</w:t>
+      </w:r>
+      <w:r>
+        <w:t>ОПИСАТЬ</w:t>
+      </w:r>
+      <w:r>
+        <w:rPr>
+          <w:lang w:val="en-US"/>
+        </w:rPr>
+        <w:t>*</w:t>
       </w:r>
     </w:p>
     <w:p>
@@ -9398,12 +9505,12 @@
       </w:pPr>
     </w:p>
     <w:sectPr>
-      <w:headerReference w:type="even" r:id="rId16"/>
-      <w:headerReference w:type="default" r:id="rId17"/>
-      <w:footerReference w:type="even" r:id="rId18"/>
-      <w:footerReference w:type="default" r:id="rId19"/>
-      <w:headerReference w:type="first" r:id="rId20"/>
-      <w:footerReference w:type="first" r:id="rId21"/>
+      <w:headerReference w:type="even" r:id="rId20"/>
+      <w:headerReference w:type="default" r:id="rId21"/>
+      <w:footerReference w:type="even" r:id="rId22"/>
+      <w:footerReference w:type="default" r:id="rId23"/>
+      <w:headerReference w:type="first" r:id="rId24"/>
+      <w:footerReference w:type="first" r:id="rId25"/>
       <w:pgSz w:w="11906" w:h="16838"/>
       <w:pgMar w:top="1134" w:right="850" w:bottom="1134" w:left="1701" w:header="708" w:footer="708" w:gutter="0"/>
       <w:cols w:space="708"/>

</xml_diff>